<commit_message>
Merge grounding/bonding Appendix A into Radio Facility Inspection checklist
Adds antenna, transceiver, tuner, and associated-equipment grounding
verification steps (A.1-A.7) plus a verification log table to the
user's edited SOP, matching the document's existing formatting.
</commit_message>
<xml_diff>
--- a/RadioFacilityInspection/Radio Facility Inspection checklist.docx
+++ b/RadioFacilityInspection/Radio Facility Inspection checklist.docx
@@ -105,7 +105,42 @@
           <w:b/>
           <w:bCs/>
         </w:rPr>
-        <w:t>Field aid, not the official record. This checklist is a working tool for flotilla examiners. It does not replace the current Auxiliary Manual (COMDTINST M16790.1), your District's Facility program SOPs, or the official Facility Examination form — confirm current 7004 form, required signatures, and standards with your FSO-CM / SO-CM / DSO-CM or DIRAUX before filing results.</w:t>
+        <w:t>Field aid, not the official record. This checklist is a working tool for flotilla examiners. It does not replace the current Auxiliary Manual (COMDTINST M16790.1), your District's Facility program SOPs, or the official Facility Examination form — confirm current 7004 form, required signatures, and standards with your FSO-CM / SO-CM / DSO-CM or DIRAUX before filing</w:t>
+      </w:r>
+    </w:p>
+    <w:p>
+      <w:pPr>
+        <w:pStyle w:val="Normal"/>
+        <w:bidi w:val="0"/>
+        <w:jc w:val="left"/>
+        <w:rPr>
+          <w:b/>
+          <w:bCs/>
+        </w:rPr>
+      </w:pPr>
+      <w:r>
+        <w:rPr>
+          <w:b/>
+          <w:bCs/>
+        </w:rPr>
+        <w:t>results.</w:t>
+      </w:r>
+    </w:p>
+    <w:p>
+      <w:pPr>
+        <w:pStyle w:val="Normal"/>
+        <w:bidi w:val="0"/>
+        <w:jc w:val="left"/>
+        <w:rPr>
+          <w:b/>
+          <w:bCs/>
+        </w:rPr>
+      </w:pPr>
+      <w:r>
+        <w:rPr>
+          <w:b/>
+          <w:bCs/>
+        </w:rPr>
       </w:r>
     </w:p>
     <w:p>
@@ -957,33 +992,33 @@
         </w:tblCellMar>
       </w:tblPr>
       <w:tblGrid>
-        <w:gridCol w:w="723"/>
-        <w:gridCol w:w="9249"/>
+        <w:gridCol w:w="722"/>
+        <w:gridCol w:w="9250"/>
       </w:tblGrid>
       <w:tr>
         <w:trPr/>
         <w:tc>
           <w:tcPr>
-            <w:tcW w:w="723" w:type="dxa"/>
-            <w:tcBorders/>
-          </w:tcPr>
-          <w:p>
-            <w:pPr>
-              <w:pStyle w:val="TableContents"/>
-              <w:widowControl w:val="false"/>
-              <w:suppressLineNumbers/>
-              <w:bidi w:val="0"/>
-              <w:jc w:val="left"/>
-              <w:rPr/>
-            </w:pPr>
-            <w:r>
-              <w:rPr/>
-            </w:r>
-          </w:p>
-        </w:tc>
-        <w:tc>
-          <w:tcPr>
-            <w:tcW w:w="9249" w:type="dxa"/>
+            <w:tcW w:w="722" w:type="dxa"/>
+            <w:tcBorders/>
+          </w:tcPr>
+          <w:p>
+            <w:pPr>
+              <w:pStyle w:val="TableContents"/>
+              <w:widowControl w:val="false"/>
+              <w:suppressLineNumbers/>
+              <w:bidi w:val="0"/>
+              <w:jc w:val="left"/>
+              <w:rPr/>
+            </w:pPr>
+            <w:r>
+              <w:rPr/>
+            </w:r>
+          </w:p>
+        </w:tc>
+        <w:tc>
+          <w:tcPr>
+            <w:tcW w:w="9250" w:type="dxa"/>
             <w:tcBorders/>
           </w:tcPr>
           <w:p>
@@ -1004,26 +1039,26 @@
         <w:trPr/>
         <w:tc>
           <w:tcPr>
-            <w:tcW w:w="723" w:type="dxa"/>
-            <w:tcBorders/>
-          </w:tcPr>
-          <w:p>
-            <w:pPr>
-              <w:pStyle w:val="TableContents"/>
-              <w:widowControl w:val="false"/>
-              <w:suppressLineNumbers/>
-              <w:bidi w:val="0"/>
-              <w:jc w:val="left"/>
-              <w:rPr/>
-            </w:pPr>
-            <w:r>
-              <w:rPr/>
-            </w:r>
-          </w:p>
-        </w:tc>
-        <w:tc>
-          <w:tcPr>
-            <w:tcW w:w="9249" w:type="dxa"/>
+            <w:tcW w:w="722" w:type="dxa"/>
+            <w:tcBorders/>
+          </w:tcPr>
+          <w:p>
+            <w:pPr>
+              <w:pStyle w:val="TableContents"/>
+              <w:widowControl w:val="false"/>
+              <w:suppressLineNumbers/>
+              <w:bidi w:val="0"/>
+              <w:jc w:val="left"/>
+              <w:rPr/>
+            </w:pPr>
+            <w:r>
+              <w:rPr/>
+            </w:r>
+          </w:p>
+        </w:tc>
+        <w:tc>
+          <w:tcPr>
+            <w:tcW w:w="9250" w:type="dxa"/>
             <w:tcBorders/>
           </w:tcPr>
           <w:p>
@@ -1044,26 +1079,26 @@
         <w:trPr/>
         <w:tc>
           <w:tcPr>
-            <w:tcW w:w="723" w:type="dxa"/>
-            <w:tcBorders/>
-          </w:tcPr>
-          <w:p>
-            <w:pPr>
-              <w:pStyle w:val="TableContents"/>
-              <w:widowControl w:val="false"/>
-              <w:suppressLineNumbers/>
-              <w:bidi w:val="0"/>
-              <w:jc w:val="left"/>
-              <w:rPr/>
-            </w:pPr>
-            <w:r>
-              <w:rPr/>
-            </w:r>
-          </w:p>
-        </w:tc>
-        <w:tc>
-          <w:tcPr>
-            <w:tcW w:w="9249" w:type="dxa"/>
+            <w:tcW w:w="722" w:type="dxa"/>
+            <w:tcBorders/>
+          </w:tcPr>
+          <w:p>
+            <w:pPr>
+              <w:pStyle w:val="TableContents"/>
+              <w:widowControl w:val="false"/>
+              <w:suppressLineNumbers/>
+              <w:bidi w:val="0"/>
+              <w:jc w:val="left"/>
+              <w:rPr/>
+            </w:pPr>
+            <w:r>
+              <w:rPr/>
+            </w:r>
+          </w:p>
+        </w:tc>
+        <w:tc>
+          <w:tcPr>
+            <w:tcW w:w="9250" w:type="dxa"/>
             <w:tcBorders/>
           </w:tcPr>
           <w:p>
@@ -1084,26 +1119,26 @@
         <w:trPr/>
         <w:tc>
           <w:tcPr>
-            <w:tcW w:w="723" w:type="dxa"/>
-            <w:tcBorders/>
-          </w:tcPr>
-          <w:p>
-            <w:pPr>
-              <w:pStyle w:val="TableContents"/>
-              <w:widowControl w:val="false"/>
-              <w:suppressLineNumbers/>
-              <w:bidi w:val="0"/>
-              <w:jc w:val="left"/>
-              <w:rPr/>
-            </w:pPr>
-            <w:r>
-              <w:rPr/>
-            </w:r>
-          </w:p>
-        </w:tc>
-        <w:tc>
-          <w:tcPr>
-            <w:tcW w:w="9249" w:type="dxa"/>
+            <w:tcW w:w="722" w:type="dxa"/>
+            <w:tcBorders/>
+          </w:tcPr>
+          <w:p>
+            <w:pPr>
+              <w:pStyle w:val="TableContents"/>
+              <w:widowControl w:val="false"/>
+              <w:suppressLineNumbers/>
+              <w:bidi w:val="0"/>
+              <w:jc w:val="left"/>
+              <w:rPr/>
+            </w:pPr>
+            <w:r>
+              <w:rPr/>
+            </w:r>
+          </w:p>
+        </w:tc>
+        <w:tc>
+          <w:tcPr>
+            <w:tcW w:w="9250" w:type="dxa"/>
             <w:tcBorders/>
           </w:tcPr>
           <w:p>
@@ -1124,26 +1159,26 @@
         <w:trPr/>
         <w:tc>
           <w:tcPr>
-            <w:tcW w:w="723" w:type="dxa"/>
-            <w:tcBorders/>
-          </w:tcPr>
-          <w:p>
-            <w:pPr>
-              <w:pStyle w:val="TableContents"/>
-              <w:widowControl w:val="false"/>
-              <w:suppressLineNumbers/>
-              <w:bidi w:val="0"/>
-              <w:jc w:val="left"/>
-              <w:rPr/>
-            </w:pPr>
-            <w:r>
-              <w:rPr/>
-            </w:r>
-          </w:p>
-        </w:tc>
-        <w:tc>
-          <w:tcPr>
-            <w:tcW w:w="9249" w:type="dxa"/>
+            <w:tcW w:w="722" w:type="dxa"/>
+            <w:tcBorders/>
+          </w:tcPr>
+          <w:p>
+            <w:pPr>
+              <w:pStyle w:val="TableContents"/>
+              <w:widowControl w:val="false"/>
+              <w:suppressLineNumbers/>
+              <w:bidi w:val="0"/>
+              <w:jc w:val="left"/>
+              <w:rPr/>
+            </w:pPr>
+            <w:r>
+              <w:rPr/>
+            </w:r>
+          </w:p>
+        </w:tc>
+        <w:tc>
+          <w:tcPr>
+            <w:tcW w:w="9250" w:type="dxa"/>
             <w:tcBorders/>
           </w:tcPr>
           <w:p>
@@ -1164,26 +1199,26 @@
         <w:trPr/>
         <w:tc>
           <w:tcPr>
-            <w:tcW w:w="723" w:type="dxa"/>
-            <w:tcBorders/>
-          </w:tcPr>
-          <w:p>
-            <w:pPr>
-              <w:pStyle w:val="TableContents"/>
-              <w:widowControl w:val="false"/>
-              <w:suppressLineNumbers/>
-              <w:bidi w:val="0"/>
-              <w:jc w:val="left"/>
-              <w:rPr/>
-            </w:pPr>
-            <w:r>
-              <w:rPr/>
-            </w:r>
-          </w:p>
-        </w:tc>
-        <w:tc>
-          <w:tcPr>
-            <w:tcW w:w="9249" w:type="dxa"/>
+            <w:tcW w:w="722" w:type="dxa"/>
+            <w:tcBorders/>
+          </w:tcPr>
+          <w:p>
+            <w:pPr>
+              <w:pStyle w:val="TableContents"/>
+              <w:widowControl w:val="false"/>
+              <w:suppressLineNumbers/>
+              <w:bidi w:val="0"/>
+              <w:jc w:val="left"/>
+              <w:rPr/>
+            </w:pPr>
+            <w:r>
+              <w:rPr/>
+            </w:r>
+          </w:p>
+        </w:tc>
+        <w:tc>
+          <w:tcPr>
+            <w:tcW w:w="9250" w:type="dxa"/>
             <w:tcBorders/>
           </w:tcPr>
           <w:p>
@@ -1278,33 +1313,33 @@
         </w:tblCellMar>
       </w:tblPr>
       <w:tblGrid>
-        <w:gridCol w:w="723"/>
-        <w:gridCol w:w="9249"/>
+        <w:gridCol w:w="722"/>
+        <w:gridCol w:w="9250"/>
       </w:tblGrid>
       <w:tr>
         <w:trPr/>
         <w:tc>
           <w:tcPr>
-            <w:tcW w:w="723" w:type="dxa"/>
-            <w:tcBorders/>
-          </w:tcPr>
-          <w:p>
-            <w:pPr>
-              <w:pStyle w:val="TableContents"/>
-              <w:widowControl w:val="false"/>
-              <w:suppressLineNumbers/>
-              <w:bidi w:val="0"/>
-              <w:jc w:val="left"/>
-              <w:rPr/>
-            </w:pPr>
-            <w:r>
-              <w:rPr/>
-            </w:r>
-          </w:p>
-        </w:tc>
-        <w:tc>
-          <w:tcPr>
-            <w:tcW w:w="9249" w:type="dxa"/>
+            <w:tcW w:w="722" w:type="dxa"/>
+            <w:tcBorders/>
+          </w:tcPr>
+          <w:p>
+            <w:pPr>
+              <w:pStyle w:val="TableContents"/>
+              <w:widowControl w:val="false"/>
+              <w:suppressLineNumbers/>
+              <w:bidi w:val="0"/>
+              <w:jc w:val="left"/>
+              <w:rPr/>
+            </w:pPr>
+            <w:r>
+              <w:rPr/>
+            </w:r>
+          </w:p>
+        </w:tc>
+        <w:tc>
+          <w:tcPr>
+            <w:tcW w:w="9250" w:type="dxa"/>
             <w:tcBorders/>
           </w:tcPr>
           <w:p>
@@ -1325,26 +1360,26 @@
         <w:trPr/>
         <w:tc>
           <w:tcPr>
-            <w:tcW w:w="723" w:type="dxa"/>
-            <w:tcBorders/>
-          </w:tcPr>
-          <w:p>
-            <w:pPr>
-              <w:pStyle w:val="TableContents"/>
-              <w:widowControl w:val="false"/>
-              <w:suppressLineNumbers/>
-              <w:bidi w:val="0"/>
-              <w:jc w:val="left"/>
-              <w:rPr/>
-            </w:pPr>
-            <w:r>
-              <w:rPr/>
-            </w:r>
-          </w:p>
-        </w:tc>
-        <w:tc>
-          <w:tcPr>
-            <w:tcW w:w="9249" w:type="dxa"/>
+            <w:tcW w:w="722" w:type="dxa"/>
+            <w:tcBorders/>
+          </w:tcPr>
+          <w:p>
+            <w:pPr>
+              <w:pStyle w:val="TableContents"/>
+              <w:widowControl w:val="false"/>
+              <w:suppressLineNumbers/>
+              <w:bidi w:val="0"/>
+              <w:jc w:val="left"/>
+              <w:rPr/>
+            </w:pPr>
+            <w:r>
+              <w:rPr/>
+            </w:r>
+          </w:p>
+        </w:tc>
+        <w:tc>
+          <w:tcPr>
+            <w:tcW w:w="9250" w:type="dxa"/>
             <w:tcBorders/>
           </w:tcPr>
           <w:p>
@@ -1365,26 +1400,26 @@
         <w:trPr/>
         <w:tc>
           <w:tcPr>
-            <w:tcW w:w="723" w:type="dxa"/>
-            <w:tcBorders/>
-          </w:tcPr>
-          <w:p>
-            <w:pPr>
-              <w:pStyle w:val="TableContents"/>
-              <w:widowControl w:val="false"/>
-              <w:suppressLineNumbers/>
-              <w:bidi w:val="0"/>
-              <w:jc w:val="left"/>
-              <w:rPr/>
-            </w:pPr>
-            <w:r>
-              <w:rPr/>
-            </w:r>
-          </w:p>
-        </w:tc>
-        <w:tc>
-          <w:tcPr>
-            <w:tcW w:w="9249" w:type="dxa"/>
+            <w:tcW w:w="722" w:type="dxa"/>
+            <w:tcBorders/>
+          </w:tcPr>
+          <w:p>
+            <w:pPr>
+              <w:pStyle w:val="TableContents"/>
+              <w:widowControl w:val="false"/>
+              <w:suppressLineNumbers/>
+              <w:bidi w:val="0"/>
+              <w:jc w:val="left"/>
+              <w:rPr/>
+            </w:pPr>
+            <w:r>
+              <w:rPr/>
+            </w:r>
+          </w:p>
+        </w:tc>
+        <w:tc>
+          <w:tcPr>
+            <w:tcW w:w="9250" w:type="dxa"/>
             <w:tcBorders/>
           </w:tcPr>
           <w:p>
@@ -1405,26 +1440,26 @@
         <w:trPr/>
         <w:tc>
           <w:tcPr>
-            <w:tcW w:w="723" w:type="dxa"/>
-            <w:tcBorders/>
-          </w:tcPr>
-          <w:p>
-            <w:pPr>
-              <w:pStyle w:val="TableContents"/>
-              <w:widowControl w:val="false"/>
-              <w:suppressLineNumbers/>
-              <w:bidi w:val="0"/>
-              <w:jc w:val="left"/>
-              <w:rPr/>
-            </w:pPr>
-            <w:r>
-              <w:rPr/>
-            </w:r>
-          </w:p>
-        </w:tc>
-        <w:tc>
-          <w:tcPr>
-            <w:tcW w:w="9249" w:type="dxa"/>
+            <w:tcW w:w="722" w:type="dxa"/>
+            <w:tcBorders/>
+          </w:tcPr>
+          <w:p>
+            <w:pPr>
+              <w:pStyle w:val="TableContents"/>
+              <w:widowControl w:val="false"/>
+              <w:suppressLineNumbers/>
+              <w:bidi w:val="0"/>
+              <w:jc w:val="left"/>
+              <w:rPr/>
+            </w:pPr>
+            <w:r>
+              <w:rPr/>
+            </w:r>
+          </w:p>
+        </w:tc>
+        <w:tc>
+          <w:tcPr>
+            <w:tcW w:w="9250" w:type="dxa"/>
             <w:tcBorders/>
           </w:tcPr>
           <w:p>
@@ -1445,26 +1480,26 @@
         <w:trPr/>
         <w:tc>
           <w:tcPr>
-            <w:tcW w:w="723" w:type="dxa"/>
-            <w:tcBorders/>
-          </w:tcPr>
-          <w:p>
-            <w:pPr>
-              <w:pStyle w:val="TableContents"/>
-              <w:widowControl w:val="false"/>
-              <w:suppressLineNumbers/>
-              <w:bidi w:val="0"/>
-              <w:jc w:val="left"/>
-              <w:rPr/>
-            </w:pPr>
-            <w:r>
-              <w:rPr/>
-            </w:r>
-          </w:p>
-        </w:tc>
-        <w:tc>
-          <w:tcPr>
-            <w:tcW w:w="9249" w:type="dxa"/>
+            <w:tcW w:w="722" w:type="dxa"/>
+            <w:tcBorders/>
+          </w:tcPr>
+          <w:p>
+            <w:pPr>
+              <w:pStyle w:val="TableContents"/>
+              <w:widowControl w:val="false"/>
+              <w:suppressLineNumbers/>
+              <w:bidi w:val="0"/>
+              <w:jc w:val="left"/>
+              <w:rPr/>
+            </w:pPr>
+            <w:r>
+              <w:rPr/>
+            </w:r>
+          </w:p>
+        </w:tc>
+        <w:tc>
+          <w:tcPr>
+            <w:tcW w:w="9250" w:type="dxa"/>
             <w:tcBorders/>
           </w:tcPr>
           <w:p>
@@ -1485,26 +1520,26 @@
         <w:trPr/>
         <w:tc>
           <w:tcPr>
-            <w:tcW w:w="723" w:type="dxa"/>
-            <w:tcBorders/>
-          </w:tcPr>
-          <w:p>
-            <w:pPr>
-              <w:pStyle w:val="TableContents"/>
-              <w:widowControl w:val="false"/>
-              <w:suppressLineNumbers/>
-              <w:bidi w:val="0"/>
-              <w:jc w:val="left"/>
-              <w:rPr/>
-            </w:pPr>
-            <w:r>
-              <w:rPr/>
-            </w:r>
-          </w:p>
-        </w:tc>
-        <w:tc>
-          <w:tcPr>
-            <w:tcW w:w="9249" w:type="dxa"/>
+            <w:tcW w:w="722" w:type="dxa"/>
+            <w:tcBorders/>
+          </w:tcPr>
+          <w:p>
+            <w:pPr>
+              <w:pStyle w:val="TableContents"/>
+              <w:widowControl w:val="false"/>
+              <w:suppressLineNumbers/>
+              <w:bidi w:val="0"/>
+              <w:jc w:val="left"/>
+              <w:rPr/>
+            </w:pPr>
+            <w:r>
+              <w:rPr/>
+            </w:r>
+          </w:p>
+        </w:tc>
+        <w:tc>
+          <w:tcPr>
+            <w:tcW w:w="9250" w:type="dxa"/>
             <w:tcBorders/>
           </w:tcPr>
           <w:p>
@@ -1525,26 +1560,26 @@
         <w:trPr/>
         <w:tc>
           <w:tcPr>
-            <w:tcW w:w="723" w:type="dxa"/>
-            <w:tcBorders/>
-          </w:tcPr>
-          <w:p>
-            <w:pPr>
-              <w:pStyle w:val="TableContents"/>
-              <w:widowControl w:val="false"/>
-              <w:suppressLineNumbers/>
-              <w:bidi w:val="0"/>
-              <w:jc w:val="left"/>
-              <w:rPr/>
-            </w:pPr>
-            <w:r>
-              <w:rPr/>
-            </w:r>
-          </w:p>
-        </w:tc>
-        <w:tc>
-          <w:tcPr>
-            <w:tcW w:w="9249" w:type="dxa"/>
+            <w:tcW w:w="722" w:type="dxa"/>
+            <w:tcBorders/>
+          </w:tcPr>
+          <w:p>
+            <w:pPr>
+              <w:pStyle w:val="TableContents"/>
+              <w:widowControl w:val="false"/>
+              <w:suppressLineNumbers/>
+              <w:bidi w:val="0"/>
+              <w:jc w:val="left"/>
+              <w:rPr/>
+            </w:pPr>
+            <w:r>
+              <w:rPr/>
+            </w:r>
+          </w:p>
+        </w:tc>
+        <w:tc>
+          <w:tcPr>
+            <w:tcW w:w="9250" w:type="dxa"/>
             <w:tcBorders/>
           </w:tcPr>
           <w:p>
@@ -1639,33 +1674,33 @@
         </w:tblCellMar>
       </w:tblPr>
       <w:tblGrid>
-        <w:gridCol w:w="723"/>
-        <w:gridCol w:w="9249"/>
+        <w:gridCol w:w="722"/>
+        <w:gridCol w:w="9250"/>
       </w:tblGrid>
       <w:tr>
         <w:trPr/>
         <w:tc>
           <w:tcPr>
-            <w:tcW w:w="723" w:type="dxa"/>
-            <w:tcBorders/>
-          </w:tcPr>
-          <w:p>
-            <w:pPr>
-              <w:pStyle w:val="TableContents"/>
-              <w:widowControl w:val="false"/>
-              <w:suppressLineNumbers/>
-              <w:bidi w:val="0"/>
-              <w:jc w:val="left"/>
-              <w:rPr/>
-            </w:pPr>
-            <w:r>
-              <w:rPr/>
-            </w:r>
-          </w:p>
-        </w:tc>
-        <w:tc>
-          <w:tcPr>
-            <w:tcW w:w="9249" w:type="dxa"/>
+            <w:tcW w:w="722" w:type="dxa"/>
+            <w:tcBorders/>
+          </w:tcPr>
+          <w:p>
+            <w:pPr>
+              <w:pStyle w:val="TableContents"/>
+              <w:widowControl w:val="false"/>
+              <w:suppressLineNumbers/>
+              <w:bidi w:val="0"/>
+              <w:jc w:val="left"/>
+              <w:rPr/>
+            </w:pPr>
+            <w:r>
+              <w:rPr/>
+            </w:r>
+          </w:p>
+        </w:tc>
+        <w:tc>
+          <w:tcPr>
+            <w:tcW w:w="9250" w:type="dxa"/>
             <w:tcBorders/>
           </w:tcPr>
           <w:p>
@@ -1686,26 +1721,26 @@
         <w:trPr/>
         <w:tc>
           <w:tcPr>
-            <w:tcW w:w="723" w:type="dxa"/>
-            <w:tcBorders/>
-          </w:tcPr>
-          <w:p>
-            <w:pPr>
-              <w:pStyle w:val="TableContents"/>
-              <w:widowControl w:val="false"/>
-              <w:suppressLineNumbers/>
-              <w:bidi w:val="0"/>
-              <w:jc w:val="left"/>
-              <w:rPr/>
-            </w:pPr>
-            <w:r>
-              <w:rPr/>
-            </w:r>
-          </w:p>
-        </w:tc>
-        <w:tc>
-          <w:tcPr>
-            <w:tcW w:w="9249" w:type="dxa"/>
+            <w:tcW w:w="722" w:type="dxa"/>
+            <w:tcBorders/>
+          </w:tcPr>
+          <w:p>
+            <w:pPr>
+              <w:pStyle w:val="TableContents"/>
+              <w:widowControl w:val="false"/>
+              <w:suppressLineNumbers/>
+              <w:bidi w:val="0"/>
+              <w:jc w:val="left"/>
+              <w:rPr/>
+            </w:pPr>
+            <w:r>
+              <w:rPr/>
+            </w:r>
+          </w:p>
+        </w:tc>
+        <w:tc>
+          <w:tcPr>
+            <w:tcW w:w="9250" w:type="dxa"/>
             <w:tcBorders/>
           </w:tcPr>
           <w:p>
@@ -1738,26 +1773,26 @@
         <w:trPr/>
         <w:tc>
           <w:tcPr>
-            <w:tcW w:w="723" w:type="dxa"/>
-            <w:tcBorders/>
-          </w:tcPr>
-          <w:p>
-            <w:pPr>
-              <w:pStyle w:val="TableContents"/>
-              <w:widowControl w:val="false"/>
-              <w:suppressLineNumbers/>
-              <w:bidi w:val="0"/>
-              <w:jc w:val="left"/>
-              <w:rPr/>
-            </w:pPr>
-            <w:r>
-              <w:rPr/>
-            </w:r>
-          </w:p>
-        </w:tc>
-        <w:tc>
-          <w:tcPr>
-            <w:tcW w:w="9249" w:type="dxa"/>
+            <w:tcW w:w="722" w:type="dxa"/>
+            <w:tcBorders/>
+          </w:tcPr>
+          <w:p>
+            <w:pPr>
+              <w:pStyle w:val="TableContents"/>
+              <w:widowControl w:val="false"/>
+              <w:suppressLineNumbers/>
+              <w:bidi w:val="0"/>
+              <w:jc w:val="left"/>
+              <w:rPr/>
+            </w:pPr>
+            <w:r>
+              <w:rPr/>
+            </w:r>
+          </w:p>
+        </w:tc>
+        <w:tc>
+          <w:tcPr>
+            <w:tcW w:w="9250" w:type="dxa"/>
             <w:tcBorders/>
           </w:tcPr>
           <w:p>
@@ -1778,26 +1813,26 @@
         <w:trPr/>
         <w:tc>
           <w:tcPr>
-            <w:tcW w:w="723" w:type="dxa"/>
-            <w:tcBorders/>
-          </w:tcPr>
-          <w:p>
-            <w:pPr>
-              <w:pStyle w:val="TableContents"/>
-              <w:widowControl w:val="false"/>
-              <w:suppressLineNumbers/>
-              <w:bidi w:val="0"/>
-              <w:jc w:val="left"/>
-              <w:rPr/>
-            </w:pPr>
-            <w:r>
-              <w:rPr/>
-            </w:r>
-          </w:p>
-        </w:tc>
-        <w:tc>
-          <w:tcPr>
-            <w:tcW w:w="9249" w:type="dxa"/>
+            <w:tcW w:w="722" w:type="dxa"/>
+            <w:tcBorders/>
+          </w:tcPr>
+          <w:p>
+            <w:pPr>
+              <w:pStyle w:val="TableContents"/>
+              <w:widowControl w:val="false"/>
+              <w:suppressLineNumbers/>
+              <w:bidi w:val="0"/>
+              <w:jc w:val="left"/>
+              <w:rPr/>
+            </w:pPr>
+            <w:r>
+              <w:rPr/>
+            </w:r>
+          </w:p>
+        </w:tc>
+        <w:tc>
+          <w:tcPr>
+            <w:tcW w:w="9250" w:type="dxa"/>
             <w:tcBorders/>
           </w:tcPr>
           <w:p>
@@ -1892,33 +1927,33 @@
         </w:tblCellMar>
       </w:tblPr>
       <w:tblGrid>
-        <w:gridCol w:w="723"/>
-        <w:gridCol w:w="9249"/>
+        <w:gridCol w:w="722"/>
+        <w:gridCol w:w="9250"/>
       </w:tblGrid>
       <w:tr>
         <w:trPr/>
         <w:tc>
           <w:tcPr>
-            <w:tcW w:w="723" w:type="dxa"/>
-            <w:tcBorders/>
-          </w:tcPr>
-          <w:p>
-            <w:pPr>
-              <w:pStyle w:val="TableContents"/>
-              <w:widowControl w:val="false"/>
-              <w:suppressLineNumbers/>
-              <w:bidi w:val="0"/>
-              <w:jc w:val="left"/>
-              <w:rPr/>
-            </w:pPr>
-            <w:r>
-              <w:rPr/>
-            </w:r>
-          </w:p>
-        </w:tc>
-        <w:tc>
-          <w:tcPr>
-            <w:tcW w:w="9249" w:type="dxa"/>
+            <w:tcW w:w="722" w:type="dxa"/>
+            <w:tcBorders/>
+          </w:tcPr>
+          <w:p>
+            <w:pPr>
+              <w:pStyle w:val="TableContents"/>
+              <w:widowControl w:val="false"/>
+              <w:suppressLineNumbers/>
+              <w:bidi w:val="0"/>
+              <w:jc w:val="left"/>
+              <w:rPr/>
+            </w:pPr>
+            <w:r>
+              <w:rPr/>
+            </w:r>
+          </w:p>
+        </w:tc>
+        <w:tc>
+          <w:tcPr>
+            <w:tcW w:w="9250" w:type="dxa"/>
             <w:tcBorders/>
           </w:tcPr>
           <w:p>
@@ -1939,26 +1974,26 @@
         <w:trPr/>
         <w:tc>
           <w:tcPr>
-            <w:tcW w:w="723" w:type="dxa"/>
-            <w:tcBorders/>
-          </w:tcPr>
-          <w:p>
-            <w:pPr>
-              <w:pStyle w:val="TableContents"/>
-              <w:widowControl w:val="false"/>
-              <w:suppressLineNumbers/>
-              <w:bidi w:val="0"/>
-              <w:jc w:val="left"/>
-              <w:rPr/>
-            </w:pPr>
-            <w:r>
-              <w:rPr/>
-            </w:r>
-          </w:p>
-        </w:tc>
-        <w:tc>
-          <w:tcPr>
-            <w:tcW w:w="9249" w:type="dxa"/>
+            <w:tcW w:w="722" w:type="dxa"/>
+            <w:tcBorders/>
+          </w:tcPr>
+          <w:p>
+            <w:pPr>
+              <w:pStyle w:val="TableContents"/>
+              <w:widowControl w:val="false"/>
+              <w:suppressLineNumbers/>
+              <w:bidi w:val="0"/>
+              <w:jc w:val="left"/>
+              <w:rPr/>
+            </w:pPr>
+            <w:r>
+              <w:rPr/>
+            </w:r>
+          </w:p>
+        </w:tc>
+        <w:tc>
+          <w:tcPr>
+            <w:tcW w:w="9250" w:type="dxa"/>
             <w:tcBorders/>
           </w:tcPr>
           <w:p>
@@ -1979,26 +2014,26 @@
         <w:trPr/>
         <w:tc>
           <w:tcPr>
-            <w:tcW w:w="723" w:type="dxa"/>
-            <w:tcBorders/>
-          </w:tcPr>
-          <w:p>
-            <w:pPr>
-              <w:pStyle w:val="TableContents"/>
-              <w:widowControl w:val="false"/>
-              <w:suppressLineNumbers/>
-              <w:bidi w:val="0"/>
-              <w:jc w:val="left"/>
-              <w:rPr/>
-            </w:pPr>
-            <w:r>
-              <w:rPr/>
-            </w:r>
-          </w:p>
-        </w:tc>
-        <w:tc>
-          <w:tcPr>
-            <w:tcW w:w="9249" w:type="dxa"/>
+            <w:tcW w:w="722" w:type="dxa"/>
+            <w:tcBorders/>
+          </w:tcPr>
+          <w:p>
+            <w:pPr>
+              <w:pStyle w:val="TableContents"/>
+              <w:widowControl w:val="false"/>
+              <w:suppressLineNumbers/>
+              <w:bidi w:val="0"/>
+              <w:jc w:val="left"/>
+              <w:rPr/>
+            </w:pPr>
+            <w:r>
+              <w:rPr/>
+            </w:r>
+          </w:p>
+        </w:tc>
+        <w:tc>
+          <w:tcPr>
+            <w:tcW w:w="9250" w:type="dxa"/>
             <w:tcBorders/>
           </w:tcPr>
           <w:p>
@@ -2019,26 +2054,26 @@
         <w:trPr/>
         <w:tc>
           <w:tcPr>
-            <w:tcW w:w="723" w:type="dxa"/>
-            <w:tcBorders/>
-          </w:tcPr>
-          <w:p>
-            <w:pPr>
-              <w:pStyle w:val="TableContents"/>
-              <w:widowControl w:val="false"/>
-              <w:suppressLineNumbers/>
-              <w:bidi w:val="0"/>
-              <w:jc w:val="left"/>
-              <w:rPr/>
-            </w:pPr>
-            <w:r>
-              <w:rPr/>
-            </w:r>
-          </w:p>
-        </w:tc>
-        <w:tc>
-          <w:tcPr>
-            <w:tcW w:w="9249" w:type="dxa"/>
+            <w:tcW w:w="722" w:type="dxa"/>
+            <w:tcBorders/>
+          </w:tcPr>
+          <w:p>
+            <w:pPr>
+              <w:pStyle w:val="TableContents"/>
+              <w:widowControl w:val="false"/>
+              <w:suppressLineNumbers/>
+              <w:bidi w:val="0"/>
+              <w:jc w:val="left"/>
+              <w:rPr/>
+            </w:pPr>
+            <w:r>
+              <w:rPr/>
+            </w:r>
+          </w:p>
+        </w:tc>
+        <w:tc>
+          <w:tcPr>
+            <w:tcW w:w="9250" w:type="dxa"/>
             <w:tcBorders/>
           </w:tcPr>
           <w:p>
@@ -2133,33 +2168,33 @@
         </w:tblCellMar>
       </w:tblPr>
       <w:tblGrid>
-        <w:gridCol w:w="723"/>
-        <w:gridCol w:w="9249"/>
+        <w:gridCol w:w="722"/>
+        <w:gridCol w:w="9250"/>
       </w:tblGrid>
       <w:tr>
         <w:trPr/>
         <w:tc>
           <w:tcPr>
-            <w:tcW w:w="723" w:type="dxa"/>
-            <w:tcBorders/>
-          </w:tcPr>
-          <w:p>
-            <w:pPr>
-              <w:pStyle w:val="TableContents"/>
-              <w:widowControl w:val="false"/>
-              <w:suppressLineNumbers/>
-              <w:bidi w:val="0"/>
-              <w:jc w:val="left"/>
-              <w:rPr/>
-            </w:pPr>
-            <w:r>
-              <w:rPr/>
-            </w:r>
-          </w:p>
-        </w:tc>
-        <w:tc>
-          <w:tcPr>
-            <w:tcW w:w="9249" w:type="dxa"/>
+            <w:tcW w:w="722" w:type="dxa"/>
+            <w:tcBorders/>
+          </w:tcPr>
+          <w:p>
+            <w:pPr>
+              <w:pStyle w:val="TableContents"/>
+              <w:widowControl w:val="false"/>
+              <w:suppressLineNumbers/>
+              <w:bidi w:val="0"/>
+              <w:jc w:val="left"/>
+              <w:rPr/>
+            </w:pPr>
+            <w:r>
+              <w:rPr/>
+            </w:r>
+          </w:p>
+        </w:tc>
+        <w:tc>
+          <w:tcPr>
+            <w:tcW w:w="9250" w:type="dxa"/>
             <w:tcBorders/>
           </w:tcPr>
           <w:p>
@@ -2180,26 +2215,26 @@
         <w:trPr/>
         <w:tc>
           <w:tcPr>
-            <w:tcW w:w="723" w:type="dxa"/>
-            <w:tcBorders/>
-          </w:tcPr>
-          <w:p>
-            <w:pPr>
-              <w:pStyle w:val="TableContents"/>
-              <w:widowControl w:val="false"/>
-              <w:suppressLineNumbers/>
-              <w:bidi w:val="0"/>
-              <w:jc w:val="left"/>
-              <w:rPr/>
-            </w:pPr>
-            <w:r>
-              <w:rPr/>
-            </w:r>
-          </w:p>
-        </w:tc>
-        <w:tc>
-          <w:tcPr>
-            <w:tcW w:w="9249" w:type="dxa"/>
+            <w:tcW w:w="722" w:type="dxa"/>
+            <w:tcBorders/>
+          </w:tcPr>
+          <w:p>
+            <w:pPr>
+              <w:pStyle w:val="TableContents"/>
+              <w:widowControl w:val="false"/>
+              <w:suppressLineNumbers/>
+              <w:bidi w:val="0"/>
+              <w:jc w:val="left"/>
+              <w:rPr/>
+            </w:pPr>
+            <w:r>
+              <w:rPr/>
+            </w:r>
+          </w:p>
+        </w:tc>
+        <w:tc>
+          <w:tcPr>
+            <w:tcW w:w="9250" w:type="dxa"/>
             <w:tcBorders/>
           </w:tcPr>
           <w:p>
@@ -2220,26 +2255,26 @@
         <w:trPr/>
         <w:tc>
           <w:tcPr>
-            <w:tcW w:w="723" w:type="dxa"/>
-            <w:tcBorders/>
-          </w:tcPr>
-          <w:p>
-            <w:pPr>
-              <w:pStyle w:val="TableContents"/>
-              <w:widowControl w:val="false"/>
-              <w:suppressLineNumbers/>
-              <w:bidi w:val="0"/>
-              <w:jc w:val="left"/>
-              <w:rPr/>
-            </w:pPr>
-            <w:r>
-              <w:rPr/>
-            </w:r>
-          </w:p>
-        </w:tc>
-        <w:tc>
-          <w:tcPr>
-            <w:tcW w:w="9249" w:type="dxa"/>
+            <w:tcW w:w="722" w:type="dxa"/>
+            <w:tcBorders/>
+          </w:tcPr>
+          <w:p>
+            <w:pPr>
+              <w:pStyle w:val="TableContents"/>
+              <w:widowControl w:val="false"/>
+              <w:suppressLineNumbers/>
+              <w:bidi w:val="0"/>
+              <w:jc w:val="left"/>
+              <w:rPr/>
+            </w:pPr>
+            <w:r>
+              <w:rPr/>
+            </w:r>
+          </w:p>
+        </w:tc>
+        <w:tc>
+          <w:tcPr>
+            <w:tcW w:w="9250" w:type="dxa"/>
             <w:tcBorders/>
           </w:tcPr>
           <w:p>
@@ -2272,26 +2307,26 @@
         <w:trPr/>
         <w:tc>
           <w:tcPr>
-            <w:tcW w:w="723" w:type="dxa"/>
-            <w:tcBorders/>
-          </w:tcPr>
-          <w:p>
-            <w:pPr>
-              <w:pStyle w:val="TableContents"/>
-              <w:widowControl w:val="false"/>
-              <w:suppressLineNumbers/>
-              <w:bidi w:val="0"/>
-              <w:jc w:val="left"/>
-              <w:rPr/>
-            </w:pPr>
-            <w:r>
-              <w:rPr/>
-            </w:r>
-          </w:p>
-        </w:tc>
-        <w:tc>
-          <w:tcPr>
-            <w:tcW w:w="9249" w:type="dxa"/>
+            <w:tcW w:w="722" w:type="dxa"/>
+            <w:tcBorders/>
+          </w:tcPr>
+          <w:p>
+            <w:pPr>
+              <w:pStyle w:val="TableContents"/>
+              <w:widowControl w:val="false"/>
+              <w:suppressLineNumbers/>
+              <w:bidi w:val="0"/>
+              <w:jc w:val="left"/>
+              <w:rPr/>
+            </w:pPr>
+            <w:r>
+              <w:rPr/>
+            </w:r>
+          </w:p>
+        </w:tc>
+        <w:tc>
+          <w:tcPr>
+            <w:tcW w:w="9250" w:type="dxa"/>
             <w:tcBorders/>
           </w:tcPr>
           <w:p>
@@ -2312,26 +2347,26 @@
         <w:trPr/>
         <w:tc>
           <w:tcPr>
-            <w:tcW w:w="723" w:type="dxa"/>
-            <w:tcBorders/>
-          </w:tcPr>
-          <w:p>
-            <w:pPr>
-              <w:pStyle w:val="TableContents"/>
-              <w:widowControl w:val="false"/>
-              <w:suppressLineNumbers/>
-              <w:bidi w:val="0"/>
-              <w:jc w:val="left"/>
-              <w:rPr/>
-            </w:pPr>
-            <w:r>
-              <w:rPr/>
-            </w:r>
-          </w:p>
-        </w:tc>
-        <w:tc>
-          <w:tcPr>
-            <w:tcW w:w="9249" w:type="dxa"/>
+            <w:tcW w:w="722" w:type="dxa"/>
+            <w:tcBorders/>
+          </w:tcPr>
+          <w:p>
+            <w:pPr>
+              <w:pStyle w:val="TableContents"/>
+              <w:widowControl w:val="false"/>
+              <w:suppressLineNumbers/>
+              <w:bidi w:val="0"/>
+              <w:jc w:val="left"/>
+              <w:rPr/>
+            </w:pPr>
+            <w:r>
+              <w:rPr/>
+            </w:r>
+          </w:p>
+        </w:tc>
+        <w:tc>
+          <w:tcPr>
+            <w:tcW w:w="9250" w:type="dxa"/>
             <w:tcBorders/>
           </w:tcPr>
           <w:p>
@@ -2352,26 +2387,26 @@
         <w:trPr/>
         <w:tc>
           <w:tcPr>
-            <w:tcW w:w="723" w:type="dxa"/>
-            <w:tcBorders/>
-          </w:tcPr>
-          <w:p>
-            <w:pPr>
-              <w:pStyle w:val="TableContents"/>
-              <w:widowControl w:val="false"/>
-              <w:suppressLineNumbers/>
-              <w:bidi w:val="0"/>
-              <w:jc w:val="left"/>
-              <w:rPr/>
-            </w:pPr>
-            <w:r>
-              <w:rPr/>
-            </w:r>
-          </w:p>
-        </w:tc>
-        <w:tc>
-          <w:tcPr>
-            <w:tcW w:w="9249" w:type="dxa"/>
+            <w:tcW w:w="722" w:type="dxa"/>
+            <w:tcBorders/>
+          </w:tcPr>
+          <w:p>
+            <w:pPr>
+              <w:pStyle w:val="TableContents"/>
+              <w:widowControl w:val="false"/>
+              <w:suppressLineNumbers/>
+              <w:bidi w:val="0"/>
+              <w:jc w:val="left"/>
+              <w:rPr/>
+            </w:pPr>
+            <w:r>
+              <w:rPr/>
+            </w:r>
+          </w:p>
+        </w:tc>
+        <w:tc>
+          <w:tcPr>
+            <w:tcW w:w="9250" w:type="dxa"/>
             <w:tcBorders/>
           </w:tcPr>
           <w:p>
@@ -2668,6 +2703,1933 @@
       <w:r>
         <w:rPr/>
         <w:t>Suggested cadence: re-examine at least every three years, and after any change of equipment, antenna, or installation location. Retain a copy with the flotilla's facility records and forward per your District's process.</w:t>
+      </w:r>
+    </w:p>
+    <w:p>
+      <w:pPr>
+        <w:pStyle w:val="Normal"/>
+        <w:rPr/>
+      </w:pPr>
+      <w:r>
+        <w:rPr/>
+      </w:r>
+      <w:r>
+        <w:br w:type="page"/>
+      </w:r>
+    </w:p>
+    <w:p>
+      <w:pPr>
+        <w:pStyle w:val="Normal"/>
+        <w:bidi w:val="0"/>
+        <w:spacing w:before="0" w:after="0"/>
+        <w:jc w:val="left"/>
+        <w:rPr>
+          <w:b/>
+          <w:bCs/>
+        </w:rPr>
+      </w:pPr>
+      <w:r>
+        <w:rPr>
+          <w:b/>
+          <w:bCs/>
+        </w:rPr>
+        <w:t>Appendix A - Grounding &amp; Bonding Verification Procedure</w:t>
+      </w:r>
+    </w:p>
+    <w:p>
+      <w:pPr>
+        <w:pStyle w:val="Normal"/>
+        <w:bidi w:val="0"/>
+        <w:jc w:val="left"/>
+        <w:rPr/>
+      </w:pPr>
+      <w:r>
+        <w:rPr/>
+      </w:r>
+    </w:p>
+    <w:p>
+      <w:pPr>
+        <w:pStyle w:val="Normal"/>
+        <w:bidi w:val="0"/>
+        <w:jc w:val="left"/>
+        <w:rPr/>
+      </w:pPr>
+      <w:r>
+        <w:rPr/>
+        <w:t>Supports Section E. Use this procedure to actually verify each grounding item rather than eyeballing it- a station can look grounded and still have a broken bond, a corroded lug, or a lost RF ground that only shows up as a ruined SWR match or a shock hazard. Work through A.1-A.7 in order; each depends on the one before it.</w:t>
+      </w:r>
+    </w:p>
+    <w:p>
+      <w:pPr>
+        <w:pStyle w:val="Normal"/>
+        <w:bidi w:val="0"/>
+        <w:jc w:val="left"/>
+        <w:rPr/>
+      </w:pPr>
+      <w:r>
+        <w:rPr/>
+      </w:r>
+    </w:p>
+    <w:p>
+      <w:pPr>
+        <w:pStyle w:val="Normal"/>
+        <w:bidi w:val="0"/>
+        <w:jc w:val="left"/>
+        <w:rPr>
+          <w:i/>
+          <w:iCs/>
+        </w:rPr>
+      </w:pPr>
+      <w:r>
+        <w:rPr>
+          <w:i/>
+          <w:iCs/>
+        </w:rPr>
+        <w:t xml:space="preserve">Tools needed: </w:t>
+      </w:r>
+      <w:r>
+        <w:rPr>
+          <w:i/>
+          <w:iCs/>
+        </w:rPr>
+        <w:t xml:space="preserve">SWR meter with cables, </w:t>
+      </w:r>
+      <w:r>
+        <w:rPr>
+          <w:i/>
+          <w:iCs/>
+        </w:rPr>
+        <w:t>digital multimeter (ohms/continuity); ground resistance tester (clamp-on or fall-of-potential), if available; wire brush or fine sandpaper; nut driver/wrench set; insulated gloves.</w:t>
+      </w:r>
+    </w:p>
+    <w:p>
+      <w:pPr>
+        <w:pStyle w:val="Normal"/>
+        <w:bidi w:val="0"/>
+        <w:jc w:val="left"/>
+        <w:rPr/>
+      </w:pPr>
+      <w:r>
+        <w:rPr/>
+      </w:r>
+    </w:p>
+    <w:p>
+      <w:pPr>
+        <w:pStyle w:val="Normal"/>
+        <w:bidi w:val="0"/>
+        <w:jc w:val="left"/>
+        <w:rPr>
+          <w:b/>
+          <w:bCs/>
+        </w:rPr>
+      </w:pPr>
+      <w:r>
+        <w:rPr>
+          <w:b/>
+          <w:bCs/>
+        </w:rPr>
+        <w:t>A.1-Single-Point Ground System (concept)</w:t>
+      </w:r>
+    </w:p>
+    <w:tbl>
+      <w:tblPr>
+        <w:tblW w:w="5000" w:type="pct"/>
+        <w:jc w:val="left"/>
+        <w:tblInd w:w="0" w:type="dxa"/>
+        <w:tblLayout w:type="fixed"/>
+        <w:tblCellMar>
+          <w:top w:w="0" w:type="dxa"/>
+          <w:left w:w="0" w:type="dxa"/>
+          <w:bottom w:w="0" w:type="dxa"/>
+          <w:right w:w="0" w:type="dxa"/>
+        </w:tblCellMar>
+      </w:tblPr>
+      <w:tblGrid>
+        <w:gridCol w:w="722"/>
+        <w:gridCol w:w="9250"/>
+      </w:tblGrid>
+      <w:tr>
+        <w:trPr/>
+        <w:tc>
+          <w:tcPr>
+            <w:tcW w:w="722" w:type="dxa"/>
+            <w:tcBorders/>
+          </w:tcPr>
+          <w:p>
+            <w:pPr>
+              <w:pStyle w:val="TableContents"/>
+              <w:widowControl w:val="false"/>
+              <w:suppressLineNumbers/>
+              <w:bidi w:val="0"/>
+              <w:jc w:val="left"/>
+              <w:rPr/>
+            </w:pPr>
+            <w:r>
+              <w:rPr/>
+              <w:t>1.</w:t>
+            </w:r>
+          </w:p>
+        </w:tc>
+        <w:tc>
+          <w:tcPr>
+            <w:tcW w:w="9250" w:type="dxa"/>
+            <w:tcBorders/>
+          </w:tcPr>
+          <w:p>
+            <w:pPr>
+              <w:pStyle w:val="Normal"/>
+              <w:bidi w:val="0"/>
+              <w:jc w:val="left"/>
+              <w:rPr/>
+            </w:pPr>
+            <w:r>
+              <w:rPr/>
+              <w:t>Confirm the station has one common ground reference-a bus bar or heavy copper strap that every piece of equipment bonds to-rather than each item running to its own separate rod or cold-water pipe. Separate grounds at different earth potentials is what turns a lightning strike into a ground loop that arcs across the room.</w:t>
+            </w:r>
+          </w:p>
+        </w:tc>
+      </w:tr>
+      <w:tr>
+        <w:trPr/>
+        <w:tc>
+          <w:tcPr>
+            <w:tcW w:w="722" w:type="dxa"/>
+            <w:tcBorders/>
+          </w:tcPr>
+          <w:p>
+            <w:pPr>
+              <w:pStyle w:val="TableContents"/>
+              <w:widowControl w:val="false"/>
+              <w:suppressLineNumbers/>
+              <w:bidi w:val="0"/>
+              <w:jc w:val="left"/>
+              <w:rPr/>
+            </w:pPr>
+            <w:r>
+              <w:rPr/>
+              <w:t>2.</w:t>
+            </w:r>
+          </w:p>
+        </w:tc>
+        <w:tc>
+          <w:tcPr>
+            <w:tcW w:w="9250" w:type="dxa"/>
+            <w:tcBorders/>
+          </w:tcPr>
+          <w:p>
+            <w:pPr>
+              <w:pStyle w:val="Normal"/>
+              <w:bidi w:val="0"/>
+              <w:jc w:val="left"/>
+              <w:rPr/>
+            </w:pPr>
+            <w:r>
+              <w:rPr/>
+              <w:t>Trace where AC safety ground (green wire), RF/station ground, and lightning ground meet. Per NEC practice they should bond together at one point near where service/antenna grounds enter the structure.</w:t>
+            </w:r>
+          </w:p>
+        </w:tc>
+      </w:tr>
+    </w:tbl>
+    <w:p>
+      <w:pPr>
+        <w:pStyle w:val="Normal"/>
+        <w:bidi w:val="0"/>
+        <w:jc w:val="left"/>
+        <w:rPr/>
+      </w:pPr>
+      <w:r>
+        <w:rPr/>
+      </w:r>
+    </w:p>
+    <w:p>
+      <w:pPr>
+        <w:pStyle w:val="Normal"/>
+        <w:bidi w:val="0"/>
+        <w:jc w:val="left"/>
+        <w:rPr>
+          <w:b/>
+          <w:bCs/>
+        </w:rPr>
+      </w:pPr>
+      <w:r>
+        <w:rPr>
+          <w:b/>
+          <w:bCs/>
+        </w:rPr>
+        <w:t>A.2-</w:t>
+      </w:r>
+      <w:r>
+        <w:rPr>
+          <w:b/>
+          <w:bCs/>
+        </w:rPr>
+        <w:t>A</w:t>
+      </w:r>
+      <w:r>
+        <w:rPr>
+          <w:b/>
+          <w:bCs/>
+        </w:rPr>
+        <w:t>ntenna System Grounding (mast/tower and feedline)</w:t>
+      </w:r>
+    </w:p>
+    <w:tbl>
+      <w:tblPr>
+        <w:tblW w:w="5000" w:type="pct"/>
+        <w:jc w:val="left"/>
+        <w:tblInd w:w="0" w:type="dxa"/>
+        <w:tblLayout w:type="fixed"/>
+        <w:tblCellMar>
+          <w:top w:w="0" w:type="dxa"/>
+          <w:left w:w="0" w:type="dxa"/>
+          <w:bottom w:w="0" w:type="dxa"/>
+          <w:right w:w="0" w:type="dxa"/>
+        </w:tblCellMar>
+      </w:tblPr>
+      <w:tblGrid>
+        <w:gridCol w:w="722"/>
+        <w:gridCol w:w="9250"/>
+      </w:tblGrid>
+      <w:tr>
+        <w:trPr/>
+        <w:tc>
+          <w:tcPr>
+            <w:tcW w:w="722" w:type="dxa"/>
+            <w:tcBorders/>
+          </w:tcPr>
+          <w:p>
+            <w:pPr>
+              <w:pStyle w:val="TableContents"/>
+              <w:widowControl w:val="false"/>
+              <w:suppressLineNumbers/>
+              <w:bidi w:val="0"/>
+              <w:jc w:val="left"/>
+              <w:rPr/>
+            </w:pPr>
+            <w:r>
+              <w:rPr/>
+              <w:t>1.</w:t>
+            </w:r>
+          </w:p>
+        </w:tc>
+        <w:tc>
+          <w:tcPr>
+            <w:tcW w:w="9250" w:type="dxa"/>
+            <w:tcBorders/>
+          </w:tcPr>
+          <w:p>
+            <w:pPr>
+              <w:pStyle w:val="Normal"/>
+              <w:bidi w:val="0"/>
+              <w:jc w:val="left"/>
+              <w:rPr/>
+            </w:pPr>
+            <w:r>
+              <w:rPr/>
+              <w:t>Visually inspect the ground rod(s) at the antenna base for corrosion, a loose clamp, or exposed/nicked bonding wire.</w:t>
+            </w:r>
+          </w:p>
+        </w:tc>
+      </w:tr>
+      <w:tr>
+        <w:trPr/>
+        <w:tc>
+          <w:tcPr>
+            <w:tcW w:w="722" w:type="dxa"/>
+            <w:tcBorders/>
+          </w:tcPr>
+          <w:p>
+            <w:pPr>
+              <w:pStyle w:val="TableContents"/>
+              <w:widowControl w:val="false"/>
+              <w:suppressLineNumbers/>
+              <w:bidi w:val="0"/>
+              <w:jc w:val="left"/>
+              <w:rPr/>
+            </w:pPr>
+            <w:r>
+              <w:rPr/>
+              <w:t>2.</w:t>
+            </w:r>
+          </w:p>
+        </w:tc>
+        <w:tc>
+          <w:tcPr>
+            <w:tcW w:w="9250" w:type="dxa"/>
+            <w:tcBorders/>
+          </w:tcPr>
+          <w:p>
+            <w:pPr>
+              <w:pStyle w:val="Normal"/>
+              <w:bidi w:val="0"/>
+              <w:jc w:val="left"/>
+              <w:rPr/>
+            </w:pPr>
+            <w:r>
+              <w:rPr/>
+              <w:t>Confirm the rod is bonded to the station ground with a short, direct run of at least #10 AWG copper wire or 3/4 inch copper strap-flat strap is preferred over round wire because it carries RF and transient surge current with less inductance.</w:t>
+            </w:r>
+          </w:p>
+        </w:tc>
+      </w:tr>
+      <w:tr>
+        <w:trPr/>
+        <w:tc>
+          <w:tcPr>
+            <w:tcW w:w="722" w:type="dxa"/>
+            <w:tcBorders/>
+          </w:tcPr>
+          <w:p>
+            <w:pPr>
+              <w:pStyle w:val="TableContents"/>
+              <w:widowControl w:val="false"/>
+              <w:suppressLineNumbers/>
+              <w:bidi w:val="0"/>
+              <w:jc w:val="left"/>
+              <w:rPr/>
+            </w:pPr>
+            <w:r>
+              <w:rPr/>
+              <w:t>3.</w:t>
+            </w:r>
+          </w:p>
+        </w:tc>
+        <w:tc>
+          <w:tcPr>
+            <w:tcW w:w="9250" w:type="dxa"/>
+            <w:tcBorders/>
+          </w:tcPr>
+          <w:p>
+            <w:pPr>
+              <w:pStyle w:val="Normal"/>
+              <w:bidi w:val="0"/>
+              <w:jc w:val="left"/>
+              <w:rPr/>
+            </w:pPr>
+            <w:r>
+              <w:rPr/>
+              <w:t>Continuity test: meter between the antenna mount/mast and the ground rod clamp. Expect well under 1 ohm. A high or unstable reading means a corroded or loose bond-clean the contact point and retest.</w:t>
+            </w:r>
+          </w:p>
+        </w:tc>
+      </w:tr>
+      <w:tr>
+        <w:trPr/>
+        <w:tc>
+          <w:tcPr>
+            <w:tcW w:w="722" w:type="dxa"/>
+            <w:tcBorders/>
+          </w:tcPr>
+          <w:p>
+            <w:pPr>
+              <w:pStyle w:val="TableContents"/>
+              <w:widowControl w:val="false"/>
+              <w:suppressLineNumbers/>
+              <w:bidi w:val="0"/>
+              <w:jc w:val="left"/>
+              <w:rPr/>
+            </w:pPr>
+            <w:r>
+              <w:rPr/>
+              <w:t>4.</w:t>
+            </w:r>
+          </w:p>
+        </w:tc>
+        <w:tc>
+          <w:tcPr>
+            <w:tcW w:w="9250" w:type="dxa"/>
+            <w:tcBorders/>
+          </w:tcPr>
+          <w:p>
+            <w:pPr>
+              <w:pStyle w:val="Normal"/>
+              <w:bidi w:val="0"/>
+              <w:jc w:val="left"/>
+              <w:rPr/>
+            </w:pPr>
+            <w:r>
+              <w:rPr/>
+              <w:t>If a ground resistance tester is available, measure the rod-to-earth resistance. Target 25 ohms or less (NEC minimum for a single rod), ideally 10 ohms or less for lightning protection. If it's high, bond in an additional rod at least 6 ft away.</w:t>
+            </w:r>
+          </w:p>
+        </w:tc>
+      </w:tr>
+      <w:tr>
+        <w:trPr/>
+        <w:tc>
+          <w:tcPr>
+            <w:tcW w:w="722" w:type="dxa"/>
+            <w:tcBorders/>
+          </w:tcPr>
+          <w:p>
+            <w:pPr>
+              <w:pStyle w:val="TableContents"/>
+              <w:widowControl w:val="false"/>
+              <w:suppressLineNumbers/>
+              <w:bidi w:val="0"/>
+              <w:jc w:val="left"/>
+              <w:rPr/>
+            </w:pPr>
+            <w:r>
+              <w:rPr/>
+              <w:t>5.</w:t>
+            </w:r>
+          </w:p>
+        </w:tc>
+        <w:tc>
+          <w:tcPr>
+            <w:tcW w:w="9250" w:type="dxa"/>
+            <w:tcBorders/>
+          </w:tcPr>
+          <w:p>
+            <w:pPr>
+              <w:pStyle w:val="Normal"/>
+              <w:bidi w:val="0"/>
+              <w:jc w:val="left"/>
+              <w:rPr/>
+            </w:pPr>
+            <w:r>
+              <w:rPr/>
+              <w:t>Confirm a coax lightning arrestor/surge suppressor is inline on the feedline and its ground lug bonds to the same ground point-not a separate one.</w:t>
+            </w:r>
+          </w:p>
+        </w:tc>
+      </w:tr>
+      <w:tr>
+        <w:trPr/>
+        <w:tc>
+          <w:tcPr>
+            <w:tcW w:w="722" w:type="dxa"/>
+            <w:tcBorders/>
+          </w:tcPr>
+          <w:p>
+            <w:pPr>
+              <w:pStyle w:val="TableContents"/>
+              <w:widowControl w:val="false"/>
+              <w:suppressLineNumbers/>
+              <w:bidi w:val="0"/>
+              <w:jc w:val="left"/>
+              <w:rPr/>
+            </w:pPr>
+            <w:r>
+              <w:rPr/>
+              <w:t>6.</w:t>
+            </w:r>
+          </w:p>
+        </w:tc>
+        <w:tc>
+          <w:tcPr>
+            <w:tcW w:w="9250" w:type="dxa"/>
+            <w:tcBorders/>
+          </w:tcPr>
+          <w:p>
+            <w:pPr>
+              <w:pStyle w:val="Normal"/>
+              <w:bidi w:val="0"/>
+              <w:jc w:val="left"/>
+              <w:rPr/>
+            </w:pPr>
+            <w:r>
+              <w:rPr/>
+              <w:t>Confirm there is a way to disconnect and ground the feedline when the station is not in use, particularly for portable/mobile setups during storm season.</w:t>
+            </w:r>
+          </w:p>
+        </w:tc>
+      </w:tr>
+    </w:tbl>
+    <w:p>
+      <w:pPr>
+        <w:pStyle w:val="Normal"/>
+        <w:bidi w:val="0"/>
+        <w:jc w:val="left"/>
+        <w:rPr>
+          <w:i/>
+          <w:iCs/>
+        </w:rPr>
+      </w:pPr>
+      <w:r>
+        <w:rPr>
+          <w:i/>
+          <w:iCs/>
+        </w:rPr>
+        <w:t>Note: Common finding: an arrestor installed but its ground lead run to a nearby fence post or downspout instead of the station ground-this defeats the single-point ground and should be corrected on the spot.</w:t>
+      </w:r>
+    </w:p>
+    <w:p>
+      <w:pPr>
+        <w:pStyle w:val="Normal"/>
+        <w:bidi w:val="0"/>
+        <w:jc w:val="left"/>
+        <w:rPr/>
+      </w:pPr>
+      <w:r>
+        <w:rPr/>
+      </w:r>
+    </w:p>
+    <w:p>
+      <w:pPr>
+        <w:pStyle w:val="Normal"/>
+        <w:bidi w:val="0"/>
+        <w:jc w:val="left"/>
+        <w:rPr>
+          <w:b/>
+          <w:bCs/>
+        </w:rPr>
+      </w:pPr>
+      <w:r>
+        <w:rPr>
+          <w:b/>
+          <w:bCs/>
+        </w:rPr>
+        <w:t>A.3-Transceiver Chassis Ground</w:t>
+      </w:r>
+    </w:p>
+    <w:tbl>
+      <w:tblPr>
+        <w:tblW w:w="5000" w:type="pct"/>
+        <w:jc w:val="left"/>
+        <w:tblInd w:w="0" w:type="dxa"/>
+        <w:tblLayout w:type="fixed"/>
+        <w:tblCellMar>
+          <w:top w:w="0" w:type="dxa"/>
+          <w:left w:w="0" w:type="dxa"/>
+          <w:bottom w:w="0" w:type="dxa"/>
+          <w:right w:w="0" w:type="dxa"/>
+        </w:tblCellMar>
+      </w:tblPr>
+      <w:tblGrid>
+        <w:gridCol w:w="722"/>
+        <w:gridCol w:w="9250"/>
+      </w:tblGrid>
+      <w:tr>
+        <w:trPr/>
+        <w:tc>
+          <w:tcPr>
+            <w:tcW w:w="722" w:type="dxa"/>
+            <w:tcBorders/>
+          </w:tcPr>
+          <w:p>
+            <w:pPr>
+              <w:pStyle w:val="TableContents"/>
+              <w:widowControl w:val="false"/>
+              <w:suppressLineNumbers/>
+              <w:bidi w:val="0"/>
+              <w:jc w:val="left"/>
+              <w:rPr/>
+            </w:pPr>
+            <w:r>
+              <w:rPr/>
+              <w:t>1.</w:t>
+            </w:r>
+          </w:p>
+        </w:tc>
+        <w:tc>
+          <w:tcPr>
+            <w:tcW w:w="9250" w:type="dxa"/>
+            <w:tcBorders/>
+          </w:tcPr>
+          <w:p>
+            <w:pPr>
+              <w:pStyle w:val="Normal"/>
+              <w:bidi w:val="0"/>
+              <w:jc w:val="left"/>
+              <w:rPr/>
+            </w:pPr>
+            <w:r>
+              <w:rPr/>
+              <w:t>Locate the chassis ground lug on the rear panel (separate from the DC power or coax connections).</w:t>
+            </w:r>
+          </w:p>
+        </w:tc>
+      </w:tr>
+      <w:tr>
+        <w:trPr/>
+        <w:tc>
+          <w:tcPr>
+            <w:tcW w:w="722" w:type="dxa"/>
+            <w:tcBorders/>
+          </w:tcPr>
+          <w:p>
+            <w:pPr>
+              <w:pStyle w:val="TableContents"/>
+              <w:widowControl w:val="false"/>
+              <w:suppressLineNumbers/>
+              <w:bidi w:val="0"/>
+              <w:jc w:val="left"/>
+              <w:rPr/>
+            </w:pPr>
+            <w:r>
+              <w:rPr/>
+              <w:t>2.</w:t>
+            </w:r>
+          </w:p>
+        </w:tc>
+        <w:tc>
+          <w:tcPr>
+            <w:tcW w:w="9250" w:type="dxa"/>
+            <w:tcBorders/>
+          </w:tcPr>
+          <w:p>
+            <w:pPr>
+              <w:pStyle w:val="Normal"/>
+              <w:bidi w:val="0"/>
+              <w:jc w:val="left"/>
+              <w:rPr/>
+            </w:pPr>
+            <w:r>
+              <w:rPr/>
+              <w:t>Confirm a dedicated ground strap runs from that lug directly to the station ground bus-the AC power cord's safety ground is not a substitute for this bond.</w:t>
+            </w:r>
+          </w:p>
+        </w:tc>
+      </w:tr>
+      <w:tr>
+        <w:trPr/>
+        <w:tc>
+          <w:tcPr>
+            <w:tcW w:w="722" w:type="dxa"/>
+            <w:tcBorders/>
+          </w:tcPr>
+          <w:p>
+            <w:pPr>
+              <w:pStyle w:val="TableContents"/>
+              <w:widowControl w:val="false"/>
+              <w:suppressLineNumbers/>
+              <w:bidi w:val="0"/>
+              <w:jc w:val="left"/>
+              <w:rPr/>
+            </w:pPr>
+            <w:r>
+              <w:rPr/>
+              <w:t>3.</w:t>
+            </w:r>
+          </w:p>
+        </w:tc>
+        <w:tc>
+          <w:tcPr>
+            <w:tcW w:w="9250" w:type="dxa"/>
+            <w:tcBorders/>
+          </w:tcPr>
+          <w:p>
+            <w:pPr>
+              <w:pStyle w:val="Normal"/>
+              <w:bidi w:val="0"/>
+              <w:jc w:val="left"/>
+              <w:rPr/>
+            </w:pPr>
+            <w:r>
+              <w:rPr/>
+              <w:t>Keep the strap as short as physically possible, and well under a quarter-wavelength of the lowest operating frequency, so it can't become a resonant radiator and re-introduce RF into the shack. Flat braid is preferred over round wire for the same low-inductance reason as A.2.</w:t>
+            </w:r>
+          </w:p>
+        </w:tc>
+      </w:tr>
+      <w:tr>
+        <w:trPr>
+          <w:trHeight w:val="231" w:hRule="atLeast"/>
+        </w:trPr>
+        <w:tc>
+          <w:tcPr>
+            <w:tcW w:w="722" w:type="dxa"/>
+            <w:tcBorders/>
+          </w:tcPr>
+          <w:p>
+            <w:pPr>
+              <w:pStyle w:val="TableContents"/>
+              <w:widowControl w:val="false"/>
+              <w:suppressLineNumbers/>
+              <w:bidi w:val="0"/>
+              <w:jc w:val="left"/>
+              <w:rPr/>
+            </w:pPr>
+            <w:r>
+              <w:rPr/>
+              <w:t>4.</w:t>
+            </w:r>
+          </w:p>
+        </w:tc>
+        <w:tc>
+          <w:tcPr>
+            <w:tcW w:w="9250" w:type="dxa"/>
+            <w:tcBorders/>
+          </w:tcPr>
+          <w:p>
+            <w:pPr>
+              <w:pStyle w:val="Normal"/>
+              <w:bidi w:val="0"/>
+              <w:jc w:val="left"/>
+              <w:rPr/>
+            </w:pPr>
+            <w:r>
+              <w:rPr/>
+              <w:t>Check the mounting point is bare metal-no paint or anodizing under the lug-and the hardware (including a star washer) is tight.</w:t>
+            </w:r>
+          </w:p>
+        </w:tc>
+      </w:tr>
+      <w:tr>
+        <w:trPr/>
+        <w:tc>
+          <w:tcPr>
+            <w:tcW w:w="722" w:type="dxa"/>
+            <w:tcBorders/>
+          </w:tcPr>
+          <w:p>
+            <w:pPr>
+              <w:pStyle w:val="TableContents"/>
+              <w:widowControl w:val="false"/>
+              <w:suppressLineNumbers/>
+              <w:bidi w:val="0"/>
+              <w:jc w:val="left"/>
+              <w:rPr/>
+            </w:pPr>
+            <w:r>
+              <w:rPr/>
+              <w:t>5.</w:t>
+            </w:r>
+          </w:p>
+        </w:tc>
+        <w:tc>
+          <w:tcPr>
+            <w:tcW w:w="9250" w:type="dxa"/>
+            <w:tcBorders/>
+          </w:tcPr>
+          <w:p>
+            <w:pPr>
+              <w:pStyle w:val="Normal"/>
+              <w:bidi w:val="0"/>
+              <w:jc w:val="left"/>
+              <w:rPr/>
+            </w:pPr>
+            <w:r>
+              <w:rPr/>
+              <w:t>Continuity test chassis-to-ground-bus: expect well under 1 ohm.</w:t>
+            </w:r>
+          </w:p>
+        </w:tc>
+      </w:tr>
+    </w:tbl>
+    <w:p>
+      <w:pPr>
+        <w:pStyle w:val="Normal"/>
+        <w:bidi w:val="0"/>
+        <w:jc w:val="left"/>
+        <w:rPr/>
+      </w:pPr>
+      <w:r>
+        <w:rPr/>
+      </w:r>
+    </w:p>
+    <w:p>
+      <w:pPr>
+        <w:pStyle w:val="Normal"/>
+        <w:bidi w:val="0"/>
+        <w:jc w:val="left"/>
+        <w:rPr>
+          <w:b/>
+          <w:bCs/>
+        </w:rPr>
+      </w:pPr>
+      <w:r>
+        <w:rPr>
+          <w:b/>
+          <w:bCs/>
+        </w:rPr>
+        <w:t>A.4 Antenna Tuner Ground</w:t>
+      </w:r>
+    </w:p>
+    <w:tbl>
+      <w:tblPr>
+        <w:tblW w:w="5000" w:type="pct"/>
+        <w:jc w:val="left"/>
+        <w:tblInd w:w="0" w:type="dxa"/>
+        <w:tblLayout w:type="fixed"/>
+        <w:tblCellMar>
+          <w:top w:w="0" w:type="dxa"/>
+          <w:left w:w="0" w:type="dxa"/>
+          <w:bottom w:w="0" w:type="dxa"/>
+          <w:right w:w="0" w:type="dxa"/>
+        </w:tblCellMar>
+      </w:tblPr>
+      <w:tblGrid>
+        <w:gridCol w:w="722"/>
+        <w:gridCol w:w="9250"/>
+      </w:tblGrid>
+      <w:tr>
+        <w:trPr/>
+        <w:tc>
+          <w:tcPr>
+            <w:tcW w:w="722" w:type="dxa"/>
+            <w:tcBorders/>
+          </w:tcPr>
+          <w:p>
+            <w:pPr>
+              <w:pStyle w:val="TableContents"/>
+              <w:widowControl w:val="false"/>
+              <w:suppressLineNumbers/>
+              <w:bidi w:val="0"/>
+              <w:jc w:val="left"/>
+              <w:rPr/>
+            </w:pPr>
+            <w:r>
+              <w:rPr/>
+              <w:t>1.</w:t>
+            </w:r>
+          </w:p>
+        </w:tc>
+        <w:tc>
+          <w:tcPr>
+            <w:tcW w:w="9250" w:type="dxa"/>
+            <w:tcBorders/>
+          </w:tcPr>
+          <w:p>
+            <w:pPr>
+              <w:pStyle w:val="Normal"/>
+              <w:bidi w:val="0"/>
+              <w:jc w:val="left"/>
+              <w:rPr/>
+            </w:pPr>
+            <w:r>
+              <w:rPr/>
+              <w:t>Locate the tuner's dedicated ground terminal-separate from the coax shield connection.</w:t>
+            </w:r>
+          </w:p>
+        </w:tc>
+      </w:tr>
+      <w:tr>
+        <w:trPr/>
+        <w:tc>
+          <w:tcPr>
+            <w:tcW w:w="722" w:type="dxa"/>
+            <w:tcBorders/>
+          </w:tcPr>
+          <w:p>
+            <w:pPr>
+              <w:pStyle w:val="TableContents"/>
+              <w:widowControl w:val="false"/>
+              <w:suppressLineNumbers/>
+              <w:bidi w:val="0"/>
+              <w:jc w:val="left"/>
+              <w:rPr/>
+            </w:pPr>
+            <w:r>
+              <w:rPr/>
+              <w:t>2.</w:t>
+            </w:r>
+          </w:p>
+        </w:tc>
+        <w:tc>
+          <w:tcPr>
+            <w:tcW w:w="9250" w:type="dxa"/>
+            <w:tcBorders/>
+          </w:tcPr>
+          <w:p>
+            <w:pPr>
+              <w:pStyle w:val="Normal"/>
+              <w:bidi w:val="0"/>
+              <w:jc w:val="left"/>
+              <w:rPr/>
+            </w:pPr>
+            <w:r>
+              <w:rPr/>
+              <w:t>Confirm it bonds directly to the station ground bus with a short, heavy strap. Many external tuners rely on this connection as part of the RF counterpoise, especially when matching a random-wire or end-fed antenna-it is not just a safety ground.</w:t>
+            </w:r>
+          </w:p>
+        </w:tc>
+      </w:tr>
+      <w:tr>
+        <w:trPr/>
+        <w:tc>
+          <w:tcPr>
+            <w:tcW w:w="722" w:type="dxa"/>
+            <w:tcBorders/>
+          </w:tcPr>
+          <w:p>
+            <w:pPr>
+              <w:pStyle w:val="TableContents"/>
+              <w:widowControl w:val="false"/>
+              <w:suppressLineNumbers/>
+              <w:bidi w:val="0"/>
+              <w:jc w:val="left"/>
+              <w:rPr/>
+            </w:pPr>
+            <w:r>
+              <w:rPr/>
+              <w:t>3.</w:t>
+            </w:r>
+          </w:p>
+        </w:tc>
+        <w:tc>
+          <w:tcPr>
+            <w:tcW w:w="9250" w:type="dxa"/>
+            <w:tcBorders/>
+          </w:tcPr>
+          <w:p>
+            <w:pPr>
+              <w:pStyle w:val="Normal"/>
+              <w:bidi w:val="0"/>
+              <w:jc w:val="left"/>
+              <w:rPr/>
+            </w:pPr>
+            <w:r>
+              <w:rPr/>
+              <w:t>If the operator reports the tuner can no longer find a match on a band it used to tune cleanly, check this bond first before suspecting the antenna itself-a lost or corroded tuner ground is the most common cause.</w:t>
+            </w:r>
+          </w:p>
+        </w:tc>
+      </w:tr>
+      <w:tr>
+        <w:trPr/>
+        <w:tc>
+          <w:tcPr>
+            <w:tcW w:w="722" w:type="dxa"/>
+            <w:tcBorders/>
+          </w:tcPr>
+          <w:p>
+            <w:pPr>
+              <w:pStyle w:val="TableContents"/>
+              <w:widowControl w:val="false"/>
+              <w:suppressLineNumbers/>
+              <w:bidi w:val="0"/>
+              <w:jc w:val="left"/>
+              <w:rPr/>
+            </w:pPr>
+            <w:r>
+              <w:rPr/>
+              <w:t>4.</w:t>
+            </w:r>
+          </w:p>
+        </w:tc>
+        <w:tc>
+          <w:tcPr>
+            <w:tcW w:w="9250" w:type="dxa"/>
+            <w:tcBorders/>
+          </w:tcPr>
+          <w:p>
+            <w:pPr>
+              <w:pStyle w:val="Normal"/>
+              <w:bidi w:val="0"/>
+              <w:jc w:val="left"/>
+              <w:rPr/>
+            </w:pPr>
+            <w:r>
+              <w:rPr/>
+              <w:t>For end-fed or random-wire antennas, confirm the counterpoise wire(s) specified by the tuner's manual are present, undamaged, and connected-the tuner ground alone is rarely sufficient without them.</w:t>
+            </w:r>
+          </w:p>
+        </w:tc>
+      </w:tr>
+    </w:tbl>
+    <w:p>
+      <w:pPr>
+        <w:pStyle w:val="Normal"/>
+        <w:bidi w:val="0"/>
+        <w:jc w:val="left"/>
+        <w:rPr/>
+      </w:pPr>
+      <w:r>
+        <w:rPr/>
+      </w:r>
+    </w:p>
+    <w:p>
+      <w:pPr>
+        <w:pStyle w:val="Normal"/>
+        <w:bidi w:val="0"/>
+        <w:jc w:val="left"/>
+        <w:rPr>
+          <w:b/>
+          <w:bCs/>
+        </w:rPr>
+      </w:pPr>
+      <w:r>
+        <w:rPr>
+          <w:b/>
+          <w:bCs/>
+        </w:rPr>
+        <w:t>A.5-Associated Equipment (power supplies, amplifiers, switches, interfaces)</w:t>
+      </w:r>
+    </w:p>
+    <w:tbl>
+      <w:tblPr>
+        <w:tblW w:w="5000" w:type="pct"/>
+        <w:jc w:val="left"/>
+        <w:tblInd w:w="0" w:type="dxa"/>
+        <w:tblLayout w:type="fixed"/>
+        <w:tblCellMar>
+          <w:top w:w="0" w:type="dxa"/>
+          <w:left w:w="0" w:type="dxa"/>
+          <w:bottom w:w="0" w:type="dxa"/>
+          <w:right w:w="0" w:type="dxa"/>
+        </w:tblCellMar>
+      </w:tblPr>
+      <w:tblGrid>
+        <w:gridCol w:w="722"/>
+        <w:gridCol w:w="9250"/>
+      </w:tblGrid>
+      <w:tr>
+        <w:trPr/>
+        <w:tc>
+          <w:tcPr>
+            <w:tcW w:w="722" w:type="dxa"/>
+            <w:tcBorders/>
+          </w:tcPr>
+          <w:p>
+            <w:pPr>
+              <w:pStyle w:val="TableContents"/>
+              <w:widowControl w:val="false"/>
+              <w:suppressLineNumbers/>
+              <w:bidi w:val="0"/>
+              <w:jc w:val="left"/>
+              <w:rPr/>
+            </w:pPr>
+            <w:r>
+              <w:rPr/>
+              <w:t>1.</w:t>
+            </w:r>
+          </w:p>
+        </w:tc>
+        <w:tc>
+          <w:tcPr>
+            <w:tcW w:w="9250" w:type="dxa"/>
+            <w:tcBorders/>
+          </w:tcPr>
+          <w:p>
+            <w:pPr>
+              <w:pStyle w:val="Normal"/>
+              <w:bidi w:val="0"/>
+              <w:jc w:val="left"/>
+              <w:rPr/>
+            </w:pPr>
+            <w:r>
+              <w:rPr/>
+              <w:t>Bond the metal chassis of every associated item-power supply, amplifier, coax switch, digital-mode/logging interface-to the same ground bus used in A.3. Never give one item its own independent ground rod; two ground points at different potentials is how ground loops and hum/RFI get introduced.</w:t>
+            </w:r>
+          </w:p>
+        </w:tc>
+      </w:tr>
+      <w:tr>
+        <w:trPr/>
+        <w:tc>
+          <w:tcPr>
+            <w:tcW w:w="722" w:type="dxa"/>
+            <w:tcBorders/>
+          </w:tcPr>
+          <w:p>
+            <w:pPr>
+              <w:pStyle w:val="TableContents"/>
+              <w:widowControl w:val="false"/>
+              <w:suppressLineNumbers/>
+              <w:bidi w:val="0"/>
+              <w:jc w:val="left"/>
+              <w:rPr/>
+            </w:pPr>
+            <w:r>
+              <w:rPr/>
+              <w:t>2.</w:t>
+            </w:r>
+          </w:p>
+        </w:tc>
+        <w:tc>
+          <w:tcPr>
+            <w:tcW w:w="9250" w:type="dxa"/>
+            <w:tcBorders/>
+          </w:tcPr>
+          <w:p>
+            <w:pPr>
+              <w:pStyle w:val="Normal"/>
+              <w:bidi w:val="0"/>
+              <w:jc w:val="left"/>
+              <w:rPr/>
+            </w:pPr>
+            <w:r>
+              <w:rPr/>
+              <w:t>For a coax switch, verify the body is grounded and check continuity through each position, not just the one currently in use.</w:t>
+            </w:r>
+          </w:p>
+        </w:tc>
+      </w:tr>
+      <w:tr>
+        <w:trPr/>
+        <w:tc>
+          <w:tcPr>
+            <w:tcW w:w="722" w:type="dxa"/>
+            <w:tcBorders/>
+          </w:tcPr>
+          <w:p>
+            <w:pPr>
+              <w:pStyle w:val="TableContents"/>
+              <w:widowControl w:val="false"/>
+              <w:suppressLineNumbers/>
+              <w:bidi w:val="0"/>
+              <w:jc w:val="left"/>
+              <w:rPr/>
+            </w:pPr>
+            <w:r>
+              <w:rPr/>
+              <w:t>3.</w:t>
+            </w:r>
+          </w:p>
+        </w:tc>
+        <w:tc>
+          <w:tcPr>
+            <w:tcW w:w="9250" w:type="dxa"/>
+            <w:tcBorders/>
+          </w:tcPr>
+          <w:p>
+            <w:pPr>
+              <w:pStyle w:val="Normal"/>
+              <w:bidi w:val="0"/>
+              <w:jc w:val="left"/>
+              <w:rPr/>
+            </w:pPr>
+            <w:r>
+              <w:rPr/>
+              <w:t>For a computer interface used for digital modes or NetLog-style logging, note whether it is opto-isolated. A non-isolated interface is a common source of RF feedback and ground-loop hum and may need an isolation transformer or ferrite choking added.</w:t>
+            </w:r>
+          </w:p>
+        </w:tc>
+      </w:tr>
+    </w:tbl>
+    <w:p>
+      <w:pPr>
+        <w:pStyle w:val="Normal"/>
+        <w:bidi w:val="0"/>
+        <w:jc w:val="left"/>
+        <w:rPr/>
+      </w:pPr>
+      <w:r>
+        <w:rPr/>
+      </w:r>
+    </w:p>
+    <w:p>
+      <w:pPr>
+        <w:pStyle w:val="Normal"/>
+        <w:bidi w:val="0"/>
+        <w:jc w:val="left"/>
+        <w:rPr>
+          <w:b/>
+          <w:bCs/>
+        </w:rPr>
+      </w:pPr>
+      <w:r>
+        <w:rPr>
+          <w:b/>
+          <w:bCs/>
+        </w:rPr>
+        <w:t>A.6 Safety Precautions While Testing</w:t>
+      </w:r>
+    </w:p>
+    <w:tbl>
+      <w:tblPr>
+        <w:tblW w:w="5000" w:type="pct"/>
+        <w:jc w:val="left"/>
+        <w:tblInd w:w="0" w:type="dxa"/>
+        <w:tblLayout w:type="fixed"/>
+        <w:tblCellMar>
+          <w:top w:w="0" w:type="dxa"/>
+          <w:left w:w="0" w:type="dxa"/>
+          <w:bottom w:w="0" w:type="dxa"/>
+          <w:right w:w="0" w:type="dxa"/>
+        </w:tblCellMar>
+      </w:tblPr>
+      <w:tblGrid>
+        <w:gridCol w:w="722"/>
+        <w:gridCol w:w="9250"/>
+      </w:tblGrid>
+      <w:tr>
+        <w:trPr/>
+        <w:tc>
+          <w:tcPr>
+            <w:tcW w:w="722" w:type="dxa"/>
+            <w:tcBorders/>
+          </w:tcPr>
+          <w:p>
+            <w:pPr>
+              <w:pStyle w:val="TableContents"/>
+              <w:widowControl w:val="false"/>
+              <w:suppressLineNumbers/>
+              <w:bidi w:val="0"/>
+              <w:jc w:val="left"/>
+              <w:rPr/>
+            </w:pPr>
+            <w:r>
+              <w:rPr/>
+              <w:t>1.</w:t>
+            </w:r>
+          </w:p>
+        </w:tc>
+        <w:tc>
+          <w:tcPr>
+            <w:tcW w:w="9250" w:type="dxa"/>
+            <w:tcBorders/>
+          </w:tcPr>
+          <w:p>
+            <w:pPr>
+              <w:pStyle w:val="Normal"/>
+              <w:bidi w:val="0"/>
+              <w:jc w:val="left"/>
+              <w:rPr/>
+            </w:pPr>
+            <w:r>
+              <w:rPr/>
+              <w:t>Never test or work on the grounding system during a thunderstorm or when lightning is possible in the area.</w:t>
+            </w:r>
+          </w:p>
+        </w:tc>
+      </w:tr>
+      <w:tr>
+        <w:trPr/>
+        <w:tc>
+          <w:tcPr>
+            <w:tcW w:w="722" w:type="dxa"/>
+            <w:tcBorders/>
+          </w:tcPr>
+          <w:p>
+            <w:pPr>
+              <w:pStyle w:val="TableContents"/>
+              <w:widowControl w:val="false"/>
+              <w:suppressLineNumbers/>
+              <w:bidi w:val="0"/>
+              <w:jc w:val="left"/>
+              <w:rPr/>
+            </w:pPr>
+            <w:r>
+              <w:rPr/>
+              <w:t>2.</w:t>
+            </w:r>
+          </w:p>
+        </w:tc>
+        <w:tc>
+          <w:tcPr>
+            <w:tcW w:w="9250" w:type="dxa"/>
+            <w:tcBorders/>
+          </w:tcPr>
+          <w:p>
+            <w:pPr>
+              <w:pStyle w:val="Normal"/>
+              <w:bidi w:val="0"/>
+              <w:jc w:val="left"/>
+              <w:rPr/>
+            </w:pPr>
+            <w:r>
+              <w:rPr/>
+              <w:t>De-energize the station before disconnecting or disturbing any bonding strap.</w:t>
+            </w:r>
+          </w:p>
+        </w:tc>
+      </w:tr>
+      <w:tr>
+        <w:trPr/>
+        <w:tc>
+          <w:tcPr>
+            <w:tcW w:w="722" w:type="dxa"/>
+            <w:tcBorders/>
+          </w:tcPr>
+          <w:p>
+            <w:pPr>
+              <w:pStyle w:val="TableContents"/>
+              <w:widowControl w:val="false"/>
+              <w:suppressLineNumbers/>
+              <w:bidi w:val="0"/>
+              <w:jc w:val="left"/>
+              <w:rPr/>
+            </w:pPr>
+            <w:r>
+              <w:rPr/>
+              <w:t>3.</w:t>
+            </w:r>
+          </w:p>
+        </w:tc>
+        <w:tc>
+          <w:tcPr>
+            <w:tcW w:w="9250" w:type="dxa"/>
+            <w:tcBorders/>
+          </w:tcPr>
+          <w:p>
+            <w:pPr>
+              <w:pStyle w:val="Normal"/>
+              <w:bidi w:val="0"/>
+              <w:jc w:val="left"/>
+              <w:rPr/>
+            </w:pPr>
+            <w:r>
+              <w:rPr/>
+              <w:t>Use insulated gloves and insulated-handle tools when probing near an energized station.</w:t>
+            </w:r>
+          </w:p>
+        </w:tc>
+      </w:tr>
+      <w:tr>
+        <w:trPr/>
+        <w:tc>
+          <w:tcPr>
+            <w:tcW w:w="722" w:type="dxa"/>
+            <w:tcBorders/>
+          </w:tcPr>
+          <w:p>
+            <w:pPr>
+              <w:pStyle w:val="TableContents"/>
+              <w:widowControl w:val="false"/>
+              <w:suppressLineNumbers/>
+              <w:bidi w:val="0"/>
+              <w:jc w:val="left"/>
+              <w:rPr/>
+            </w:pPr>
+            <w:r>
+              <w:rPr/>
+              <w:t>4.</w:t>
+            </w:r>
+          </w:p>
+        </w:tc>
+        <w:tc>
+          <w:tcPr>
+            <w:tcW w:w="9250" w:type="dxa"/>
+            <w:tcBorders/>
+          </w:tcPr>
+          <w:p>
+            <w:pPr>
+              <w:pStyle w:val="Normal"/>
+              <w:bidi w:val="0"/>
+              <w:jc w:val="left"/>
+              <w:rPr/>
+            </w:pPr>
+            <w:r>
+              <w:rPr/>
+              <w:t>After any known lightning event near the station, re-inspect and re-test the entire ground system in full before returning the station to service.</w:t>
+            </w:r>
+          </w:p>
+        </w:tc>
+      </w:tr>
+    </w:tbl>
+    <w:p>
+      <w:pPr>
+        <w:pStyle w:val="Normal"/>
+        <w:bidi w:val="0"/>
+        <w:jc w:val="left"/>
+        <w:rPr/>
+      </w:pPr>
+      <w:r>
+        <w:rPr/>
+      </w:r>
+    </w:p>
+    <w:p>
+      <w:pPr>
+        <w:pStyle w:val="Normal"/>
+        <w:bidi w:val="0"/>
+        <w:jc w:val="left"/>
+        <w:rPr>
+          <w:b/>
+          <w:bCs/>
+        </w:rPr>
+      </w:pPr>
+      <w:r>
+        <w:rPr>
+          <w:b/>
+          <w:bCs/>
+        </w:rPr>
+        <w:t>A.7-Verification Log</w:t>
+      </w:r>
+    </w:p>
+    <w:p>
+      <w:pPr>
+        <w:pStyle w:val="Normal"/>
+        <w:bidi w:val="0"/>
+        <w:jc w:val="left"/>
+        <w:rPr/>
+      </w:pPr>
+      <w:r>
+        <w:rPr/>
+      </w:r>
+    </w:p>
+    <w:tbl>
+      <w:tblPr>
+        <w:tblW w:w="5000" w:type="pct"/>
+        <w:jc w:val="left"/>
+        <w:tblInd w:w="0" w:type="dxa"/>
+        <w:tblLayout w:type="fixed"/>
+        <w:tblCellMar>
+          <w:top w:w="40" w:type="dxa"/>
+          <w:left w:w="80" w:type="dxa"/>
+          <w:bottom w:w="40" w:type="dxa"/>
+          <w:right w:w="80" w:type="dxa"/>
+        </w:tblCellMar>
+      </w:tblPr>
+      <w:tblGrid>
+        <w:gridCol w:w="2991"/>
+        <w:gridCol w:w="1795"/>
+        <w:gridCol w:w="1596"/>
+        <w:gridCol w:w="3590"/>
+      </w:tblGrid>
+      <w:tr>
+        <w:trPr/>
+        <w:tc>
+          <w:tcPr>
+            <w:tcW w:w="2991" w:type="dxa"/>
+            <w:tcBorders/>
+          </w:tcPr>
+          <w:p>
+            <w:pPr>
+              <w:pStyle w:val="TableContents"/>
+              <w:bidi w:val="0"/>
+              <w:jc w:val="center"/>
+              <w:rPr>
+                <w:b/>
+                <w:bCs/>
+              </w:rPr>
+            </w:pPr>
+            <w:r>
+              <w:rPr>
+                <w:b/>
+                <w:bCs/>
+              </w:rPr>
+              <w:t>Point Tested</w:t>
+            </w:r>
+          </w:p>
+        </w:tc>
+        <w:tc>
+          <w:tcPr>
+            <w:tcW w:w="1795" w:type="dxa"/>
+            <w:tcBorders/>
+          </w:tcPr>
+          <w:p>
+            <w:pPr>
+              <w:pStyle w:val="TableContents"/>
+              <w:bidi w:val="0"/>
+              <w:jc w:val="center"/>
+              <w:rPr>
+                <w:b/>
+                <w:bCs/>
+              </w:rPr>
+            </w:pPr>
+            <w:r>
+              <w:rPr>
+                <w:b/>
+                <w:bCs/>
+              </w:rPr>
+              <w:t>Reading</w:t>
+            </w:r>
+          </w:p>
+        </w:tc>
+        <w:tc>
+          <w:tcPr>
+            <w:tcW w:w="1596" w:type="dxa"/>
+            <w:tcBorders/>
+          </w:tcPr>
+          <w:p>
+            <w:pPr>
+              <w:pStyle w:val="TableContents"/>
+              <w:bidi w:val="0"/>
+              <w:jc w:val="center"/>
+              <w:rPr>
+                <w:b/>
+                <w:bCs/>
+              </w:rPr>
+            </w:pPr>
+            <w:r>
+              <w:rPr>
+                <w:b/>
+                <w:bCs/>
+              </w:rPr>
+              <w:t>Result</w:t>
+            </w:r>
+          </w:p>
+        </w:tc>
+        <w:tc>
+          <w:tcPr>
+            <w:tcW w:w="3590" w:type="dxa"/>
+            <w:tcBorders/>
+          </w:tcPr>
+          <w:p>
+            <w:pPr>
+              <w:pStyle w:val="TableContents"/>
+              <w:bidi w:val="0"/>
+              <w:jc w:val="center"/>
+              <w:rPr>
+                <w:b/>
+                <w:bCs/>
+              </w:rPr>
+            </w:pPr>
+            <w:r>
+              <w:rPr>
+                <w:b/>
+                <w:bCs/>
+              </w:rPr>
+              <w:t>Notes</w:t>
+            </w:r>
+          </w:p>
+        </w:tc>
+      </w:tr>
+      <w:tr>
+        <w:trPr/>
+        <w:tc>
+          <w:tcPr>
+            <w:tcW w:w="2991" w:type="dxa"/>
+            <w:tcBorders/>
+          </w:tcPr>
+          <w:p>
+            <w:pPr>
+              <w:pStyle w:val="TableContents"/>
+              <w:bidi w:val="0"/>
+              <w:jc w:val="left"/>
+              <w:rPr/>
+            </w:pPr>
+            <w:r>
+              <w:rPr/>
+              <w:t>Antenna mast -&gt; ground rod</w:t>
+            </w:r>
+          </w:p>
+        </w:tc>
+        <w:tc>
+          <w:tcPr>
+            <w:tcW w:w="1795" w:type="dxa"/>
+            <w:tcBorders/>
+          </w:tcPr>
+          <w:p>
+            <w:pPr>
+              <w:pStyle w:val="TableContents"/>
+              <w:bidi w:val="0"/>
+              <w:jc w:val="left"/>
+              <w:rPr/>
+            </w:pPr>
+            <w:r>
+              <w:rPr/>
+            </w:r>
+          </w:p>
+        </w:tc>
+        <w:tc>
+          <w:tcPr>
+            <w:tcW w:w="1596" w:type="dxa"/>
+            <w:tcBorders/>
+          </w:tcPr>
+          <w:p>
+            <w:pPr>
+              <w:pStyle w:val="TableContents"/>
+              <w:bidi w:val="0"/>
+              <w:jc w:val="left"/>
+              <w:rPr/>
+            </w:pPr>
+            <w:r>
+              <w:rPr/>
+            </w:r>
+          </w:p>
+        </w:tc>
+        <w:tc>
+          <w:tcPr>
+            <w:tcW w:w="3590" w:type="dxa"/>
+            <w:tcBorders/>
+          </w:tcPr>
+          <w:p>
+            <w:pPr>
+              <w:pStyle w:val="TableContents"/>
+              <w:bidi w:val="0"/>
+              <w:jc w:val="left"/>
+              <w:rPr/>
+            </w:pPr>
+            <w:r>
+              <w:rPr/>
+            </w:r>
+          </w:p>
+        </w:tc>
+      </w:tr>
+      <w:tr>
+        <w:trPr/>
+        <w:tc>
+          <w:tcPr>
+            <w:tcW w:w="2991" w:type="dxa"/>
+            <w:tcBorders/>
+          </w:tcPr>
+          <w:p>
+            <w:pPr>
+              <w:pStyle w:val="TableContents"/>
+              <w:bidi w:val="0"/>
+              <w:jc w:val="left"/>
+              <w:rPr/>
+            </w:pPr>
+            <w:r>
+              <w:rPr/>
+              <w:t>Ground rod -&gt; earth</w:t>
+            </w:r>
+          </w:p>
+        </w:tc>
+        <w:tc>
+          <w:tcPr>
+            <w:tcW w:w="1795" w:type="dxa"/>
+            <w:tcBorders/>
+          </w:tcPr>
+          <w:p>
+            <w:pPr>
+              <w:pStyle w:val="TableContents"/>
+              <w:bidi w:val="0"/>
+              <w:jc w:val="left"/>
+              <w:rPr/>
+            </w:pPr>
+            <w:r>
+              <w:rPr/>
+            </w:r>
+          </w:p>
+        </w:tc>
+        <w:tc>
+          <w:tcPr>
+            <w:tcW w:w="1596" w:type="dxa"/>
+            <w:tcBorders/>
+          </w:tcPr>
+          <w:p>
+            <w:pPr>
+              <w:pStyle w:val="TableContents"/>
+              <w:bidi w:val="0"/>
+              <w:jc w:val="left"/>
+              <w:rPr/>
+            </w:pPr>
+            <w:r>
+              <w:rPr/>
+            </w:r>
+          </w:p>
+        </w:tc>
+        <w:tc>
+          <w:tcPr>
+            <w:tcW w:w="3590" w:type="dxa"/>
+            <w:tcBorders/>
+          </w:tcPr>
+          <w:p>
+            <w:pPr>
+              <w:pStyle w:val="TableContents"/>
+              <w:bidi w:val="0"/>
+              <w:jc w:val="left"/>
+              <w:rPr/>
+            </w:pPr>
+            <w:r>
+              <w:rPr/>
+            </w:r>
+          </w:p>
+        </w:tc>
+      </w:tr>
+      <w:tr>
+        <w:trPr/>
+        <w:tc>
+          <w:tcPr>
+            <w:tcW w:w="2991" w:type="dxa"/>
+            <w:tcBorders/>
+          </w:tcPr>
+          <w:p>
+            <w:pPr>
+              <w:pStyle w:val="TableContents"/>
+              <w:bidi w:val="0"/>
+              <w:jc w:val="left"/>
+              <w:rPr/>
+            </w:pPr>
+            <w:r>
+              <w:rPr/>
+              <w:t>Transceiver chassis -&gt; bus</w:t>
+            </w:r>
+          </w:p>
+        </w:tc>
+        <w:tc>
+          <w:tcPr>
+            <w:tcW w:w="1795" w:type="dxa"/>
+            <w:tcBorders/>
+          </w:tcPr>
+          <w:p>
+            <w:pPr>
+              <w:pStyle w:val="TableContents"/>
+              <w:bidi w:val="0"/>
+              <w:jc w:val="left"/>
+              <w:rPr/>
+            </w:pPr>
+            <w:r>
+              <w:rPr/>
+            </w:r>
+          </w:p>
+        </w:tc>
+        <w:tc>
+          <w:tcPr>
+            <w:tcW w:w="1596" w:type="dxa"/>
+            <w:tcBorders/>
+          </w:tcPr>
+          <w:p>
+            <w:pPr>
+              <w:pStyle w:val="TableContents"/>
+              <w:bidi w:val="0"/>
+              <w:jc w:val="left"/>
+              <w:rPr/>
+            </w:pPr>
+            <w:r>
+              <w:rPr/>
+            </w:r>
+          </w:p>
+        </w:tc>
+        <w:tc>
+          <w:tcPr>
+            <w:tcW w:w="3590" w:type="dxa"/>
+            <w:tcBorders/>
+          </w:tcPr>
+          <w:p>
+            <w:pPr>
+              <w:pStyle w:val="TableContents"/>
+              <w:bidi w:val="0"/>
+              <w:jc w:val="left"/>
+              <w:rPr/>
+            </w:pPr>
+            <w:r>
+              <w:rPr/>
+            </w:r>
+          </w:p>
+        </w:tc>
+      </w:tr>
+      <w:tr>
+        <w:trPr/>
+        <w:tc>
+          <w:tcPr>
+            <w:tcW w:w="2991" w:type="dxa"/>
+            <w:tcBorders/>
+          </w:tcPr>
+          <w:p>
+            <w:pPr>
+              <w:pStyle w:val="TableContents"/>
+              <w:bidi w:val="0"/>
+              <w:jc w:val="left"/>
+              <w:rPr/>
+            </w:pPr>
+            <w:r>
+              <w:rPr/>
+              <w:t>Tuner ground -&gt; bus</w:t>
+            </w:r>
+          </w:p>
+        </w:tc>
+        <w:tc>
+          <w:tcPr>
+            <w:tcW w:w="1795" w:type="dxa"/>
+            <w:tcBorders/>
+          </w:tcPr>
+          <w:p>
+            <w:pPr>
+              <w:pStyle w:val="TableContents"/>
+              <w:bidi w:val="0"/>
+              <w:jc w:val="left"/>
+              <w:rPr/>
+            </w:pPr>
+            <w:r>
+              <w:rPr/>
+            </w:r>
+          </w:p>
+        </w:tc>
+        <w:tc>
+          <w:tcPr>
+            <w:tcW w:w="1596" w:type="dxa"/>
+            <w:tcBorders/>
+          </w:tcPr>
+          <w:p>
+            <w:pPr>
+              <w:pStyle w:val="TableContents"/>
+              <w:bidi w:val="0"/>
+              <w:jc w:val="left"/>
+              <w:rPr/>
+            </w:pPr>
+            <w:r>
+              <w:rPr/>
+            </w:r>
+          </w:p>
+        </w:tc>
+        <w:tc>
+          <w:tcPr>
+            <w:tcW w:w="3590" w:type="dxa"/>
+            <w:tcBorders/>
+          </w:tcPr>
+          <w:p>
+            <w:pPr>
+              <w:pStyle w:val="TableContents"/>
+              <w:bidi w:val="0"/>
+              <w:jc w:val="left"/>
+              <w:rPr/>
+            </w:pPr>
+            <w:r>
+              <w:rPr/>
+            </w:r>
+          </w:p>
+        </w:tc>
+      </w:tr>
+      <w:tr>
+        <w:trPr/>
+        <w:tc>
+          <w:tcPr>
+            <w:tcW w:w="2991" w:type="dxa"/>
+            <w:tcBorders/>
+          </w:tcPr>
+          <w:p>
+            <w:pPr>
+              <w:pStyle w:val="TableContents"/>
+              <w:bidi w:val="0"/>
+              <w:jc w:val="left"/>
+              <w:rPr/>
+            </w:pPr>
+            <w:r>
+              <w:rPr/>
+              <w:t>Other equipment -&gt; bus</w:t>
+            </w:r>
+          </w:p>
+        </w:tc>
+        <w:tc>
+          <w:tcPr>
+            <w:tcW w:w="1795" w:type="dxa"/>
+            <w:tcBorders/>
+          </w:tcPr>
+          <w:p>
+            <w:pPr>
+              <w:pStyle w:val="TableContents"/>
+              <w:bidi w:val="0"/>
+              <w:jc w:val="left"/>
+              <w:rPr/>
+            </w:pPr>
+            <w:r>
+              <w:rPr/>
+            </w:r>
+          </w:p>
+        </w:tc>
+        <w:tc>
+          <w:tcPr>
+            <w:tcW w:w="1596" w:type="dxa"/>
+            <w:tcBorders/>
+          </w:tcPr>
+          <w:p>
+            <w:pPr>
+              <w:pStyle w:val="TableContents"/>
+              <w:bidi w:val="0"/>
+              <w:jc w:val="left"/>
+              <w:rPr/>
+            </w:pPr>
+            <w:r>
+              <w:rPr/>
+            </w:r>
+          </w:p>
+        </w:tc>
+        <w:tc>
+          <w:tcPr>
+            <w:tcW w:w="3590" w:type="dxa"/>
+            <w:tcBorders/>
+          </w:tcPr>
+          <w:p>
+            <w:pPr>
+              <w:pStyle w:val="TableContents"/>
+              <w:bidi w:val="0"/>
+              <w:jc w:val="left"/>
+              <w:rPr/>
+            </w:pPr>
+            <w:r>
+              <w:rPr/>
+            </w:r>
+          </w:p>
+        </w:tc>
+      </w:tr>
+    </w:tbl>
+    <w:p>
+      <w:pPr>
+        <w:pStyle w:val="Normal"/>
+        <w:bidi w:val="0"/>
+        <w:jc w:val="left"/>
+        <w:rPr/>
+      </w:pPr>
+      <w:r>
+        <w:rPr/>
       </w:r>
     </w:p>
     <w:sectPr>

</xml_diff>